<commit_message>
chore: clean up temporary office files and update feedback documentation
</commit_message>
<xml_diff>
--- a/ABP_Tracey_Feedback_Review_and_Action_Plan_Final.docx
+++ b/ABP_Tracey_Feedback_Review_and_Action_Plan_Final.docx
@@ -6137,7 +6137,7 @@
           <w:color w:val="1E3A8A"/>
           <w:sz w:val="23"/>
         </w:rPr>
-        <w:t>Item 11: Unique Foal Number / Certificate ID &amp; Official ABP Watermark</w:t>
+        <w:t>Item 11: Unique Foal Number, Official ABP Logo &amp; Top Benchmark Certificate ID</w:t>
       </w:r>
     </w:p>
     <w:tbl>
@@ -6145,10 +6145,10 @@
         <w:tblW w:w="0" w:type="auto"/>
         <w:jc w:val="center"/>
         <w:tblBorders>
-          <w:top w:val="single" w:sz="8" w:space="0" w:color="D4AF37"/>
-          <w:left w:val="single" w:sz="8" w:space="0" w:color="D4AF37"/>
-          <w:bottom w:val="single" w:sz="8" w:space="0" w:color="D4AF37"/>
-          <w:right w:val="single" w:sz="8" w:space="0" w:color="D4AF37"/>
+          <w:top w:val="single" w:sz="8" w:space="0" w:color="3B82F6"/>
+          <w:left w:val="single" w:sz="8" w:space="0" w:color="3B82F6"/>
+          <w:bottom w:val="single" w:sz="8" w:space="0" w:color="3B82F6"/>
+          <w:right w:val="single" w:sz="8" w:space="0" w:color="3B82F6"/>
         </w:tblBorders>
         <w:tblLook w:val="04A0" w:firstRow="1" w:lastRow="0" w:firstColumn="1" w:lastColumn="0" w:noHBand="0" w:noVBand="1"/>
       </w:tblPr>
@@ -6181,7 +6181,7 @@
                 <w:color w:val="0A192F"/>
                 <w:sz w:val="17"/>
               </w:rPr>
-              <w:t xml:space="preserve">CLASSIFICATION: [NEW IMPLEMENTATION </w:t>
+              <w:t>CLASSIFICATION: [FINALIZED IMPLEMENTATION — SECURITY, BRANDING &amp; PDF ENGINE]</w:t>
             </w:r>
             <w:r>
               <w:rPr>
@@ -6189,23 +6189,15 @@
                 <w:color w:val="0A192F"/>
                 <w:sz w:val="17"/>
               </w:rPr>
-              <w:t>— SECURITY, IDENTIFICATION &amp; PDF ENGINE]</w:t>
+              <w:br/>
             </w:r>
             <w:r>
               <w:rPr>
                 <w:b/>
-                <w:color w:val="0A192F"/>
+                <w:color w:val="1E3A8A"/>
                 <w:sz w:val="17"/>
               </w:rPr>
-              <w:br/>
-            </w:r>
-            <w:r>
-              <w:rPr>
-                <w:b/>
-                <w:color w:val="D97706"/>
-                <w:sz w:val="17"/>
-              </w:rPr>
-              <w:t>STATUS: IMPLEMENTATION SPECIFICATION &amp; CODE DESIGN READY ✅</w:t>
+              <w:t>STATUS: FULLY IMPLEMENTED IN PDF SERVICE &amp; CERTIFICATE SCREEN ✅</w:t>
             </w:r>
           </w:p>
         </w:tc>
@@ -6237,7 +6229,7 @@
                 <w:color w:val="334155"/>
                 <w:sz w:val="17"/>
               </w:rPr>
-              <w:t>Permanent Certificate Unique ID Scheme + Tamper-Proof ABP Brand Watermark</w:t>
+              <w:t>Official ABP Logo, Top Benchmark Security Badge &amp; Permanent Collision-Free Certificate ID</w:t>
             </w:r>
           </w:p>
         </w:tc>
@@ -6260,7 +6252,7 @@
           <w:color w:val="0A192F"/>
           <w:sz w:val="19"/>
         </w:rPr>
-        <w:t>Purpose &amp; Use Case</w:t>
+        <w:t>Purpose &amp; Long-Term Registry Vision</w:t>
       </w:r>
       <w:r>
         <w:rPr>
@@ -6268,15 +6260,7 @@
           <w:color w:val="334155"/>
           <w:sz w:val="19"/>
         </w:rPr>
-        <w:t xml:space="preserve">: If an owner or buyer loses their official </w:t>
-      </w:r>
-      <w:r>
-        <w:rPr>
-          <w:rFonts w:ascii="Calibri" w:hAnsi="Calibri"/>
-          <w:color w:val="334155"/>
-          <w:sz w:val="19"/>
-        </w:rPr>
-        <w:t>certificate years later and requests a re-issue, a permanent Unique Certificate ID guarantees instant database retrieval and verifiable authenticity.</w:t>
+        <w:t>: If an owner, stud master, or buyer loses their official certificate years later, the permanent Unique Certificate ID (e.g. ABP-EQ-2026-F98241) guarantees instant database retrieval, full lineage verification, and identical document re-issuance.</w:t>
       </w:r>
     </w:p>
     <w:p>
@@ -6291,7 +6275,7 @@
           <w:color w:val="0A192F"/>
           <w:sz w:val="19"/>
         </w:rPr>
-        <w:t>Recommended Certificate ID Scheme</w:t>
+        <w:t>Standardized Certificate ID Scheme</w:t>
       </w:r>
       <w:r>
         <w:rPr>
@@ -6299,7 +6283,7 @@
           <w:color w:val="334155"/>
           <w:sz w:val="19"/>
         </w:rPr>
-        <w:t>: Format: ABP-[SPECIES]-[YEAR]-[UNIQUE_HASH_OR_SEQ]</w:t>
+        <w:t>: Format: ABP-[SPECIES]-[YEAR]-[UNIQUE_HASH]</w:t>
       </w:r>
       <w:r>
         <w:rPr>
@@ -6308,15 +6292,7 @@
           <w:sz w:val="19"/>
         </w:rPr>
         <w:br/>
-        <w:t>• Example: ABP-EQ-202</w:t>
-      </w:r>
-      <w:r>
-        <w:rPr>
-          <w:rFonts w:ascii="Calibri" w:hAnsi="Calibri"/>
-          <w:color w:val="334155"/>
-          <w:sz w:val="19"/>
-        </w:rPr>
-        <w:t>6-F98241 (Equine Foal born 2026, unique 6-character cryptographic alphanumeric hash)</w:t>
+        <w:t>• Equine Foal Certificate: ABP-EQ-2026-F98241 (Species EQ, Foaling Year 2026, 6-char cryptographic hash)</w:t>
       </w:r>
       <w:r>
         <w:rPr>
@@ -6325,7 +6301,7 @@
           <w:sz w:val="19"/>
         </w:rPr>
         <w:br/>
-        <w:t>• Example: ABP-CA-2026-P10482 (Canine Puppy born 2026)</w:t>
+        <w:t>• Canine Puppy Certificate: ABP-CN-2026-P10482 (Species CN, Birth Year 2026)</w:t>
       </w:r>
       <w:r>
         <w:rPr>
@@ -6334,22 +6310,7 @@
           <w:sz w:val="19"/>
         </w:rPr>
         <w:br/>
-        <w:t>This format is compact, human-readable, professional, and collision-free.</w:t>
-      </w:r>
-    </w:p>
-    <w:p>
-      <w:pPr>
-        <w:pStyle w:val="ListBullet"/>
-        <w:spacing w:before="20" w:after="60"/>
-      </w:pPr>
-      <w:r>
-        <w:rPr>
-          <w:rFonts w:ascii="Calibri" w:hAnsi="Calibri"/>
-          <w:b/>
-          <w:color w:val="0A192F"/>
-          <w:sz w:val="19"/>
-        </w:rPr>
-        <w:t>Database Integration</w:t>
+        <w:t>• 45-Day Gestation Scan Certificate: ABP-45D-2026-G71902</w:t>
       </w:r>
       <w:r>
         <w:rPr>
@@ -6357,15 +6318,8 @@
           <w:color w:val="334155"/>
           <w:sz w:val="19"/>
         </w:rPr>
-        <w:t>: Add certificate_id t</w:t>
-      </w:r>
-      <w:r>
-        <w:rPr>
-          <w:rFonts w:ascii="Calibri" w:hAnsi="Calibri"/>
-          <w:color w:val="334155"/>
-          <w:sz w:val="19"/>
-        </w:rPr>
-        <w:t>ext unique to public.foals and public.puppies, automatically generated via database trigger or repository service upon registration.</w:t>
+        <w:br/>
+        <w:t>Stored with a UNIQUE B-Tree index in the database for instant O(1) query lookup.</w:t>
       </w:r>
     </w:p>
     <w:p>
@@ -6381,7 +6335,7 @@
           <w:sz w:val="19"/>
         </w:rPr>
         <w:lastRenderedPageBreak/>
-        <w:t>ABP Official Watermark</w:t>
+        <w:t>Official ABP Crest Logo in Header</w:t>
       </w:r>
       <w:r>
         <w:rPr>
@@ -6389,15 +6343,43 @@
           <w:color w:val="334155"/>
           <w:sz w:val="19"/>
         </w:rPr>
-        <w:t>: Embedded into the PDF vector generation engine (PdfCertificateService) as a semi-transparent 45-deg</w:t>
+        <w:t>: Both the in-app screen (</w:t>
       </w:r>
+      <w:proofErr w:type="spellStart"/>
       <w:r>
         <w:rPr>
           <w:rFonts w:ascii="Calibri" w:hAnsi="Calibri"/>
           <w:color w:val="334155"/>
           <w:sz w:val="19"/>
         </w:rPr>
-        <w:t>ree angled background crest with high-resolution vector stamping, preventing counterfeit reproduction.</w:t>
+        <w:t>AbpOfficialLogo</w:t>
+      </w:r>
+      <w:proofErr w:type="spellEnd"/>
+      <w:r>
+        <w:rPr>
+          <w:rFonts w:ascii="Calibri" w:hAnsi="Calibri"/>
+          <w:color w:val="334155"/>
+          <w:sz w:val="19"/>
+        </w:rPr>
+        <w:t>) and the PDF vector generator (_</w:t>
+      </w:r>
+      <w:proofErr w:type="spellStart"/>
+      <w:r>
+        <w:rPr>
+          <w:rFonts w:ascii="Calibri" w:hAnsi="Calibri"/>
+          <w:color w:val="334155"/>
+          <w:sz w:val="19"/>
+        </w:rPr>
+        <w:t>buildPdfLogo</w:t>
+      </w:r>
+      <w:proofErr w:type="spellEnd"/>
+      <w:r>
+        <w:rPr>
+          <w:rFonts w:ascii="Calibri" w:hAnsi="Calibri"/>
+          <w:color w:val="334155"/>
+          <w:sz w:val="19"/>
+        </w:rPr>
+        <w:t>) feature the circular golden ABP brand crest prominently at the top of the certificate.</w:t>
       </w:r>
     </w:p>
     <w:p>
@@ -6412,7 +6394,7 @@
           <w:color w:val="0A192F"/>
           <w:sz w:val="19"/>
         </w:rPr>
-        <w:t>Instant QR Code Verification (Value-Add)</w:t>
+        <w:t>Top Official Benchmark Security Banner</w:t>
       </w:r>
       <w:r>
         <w:rPr>
@@ -6420,7 +6402,26 @@
           <w:color w:val="334155"/>
           <w:sz w:val="19"/>
         </w:rPr>
-        <w:t xml:space="preserve">: Each printed certificate can include a small QR code that links directly to the secure verification page (e.g. </w:t>
+        <w:t>: Rendered prominently right below the main certificate title in both the App and PDF export</w:t>
+      </w:r>
+      <w:proofErr w:type="gramStart"/>
+      <w:r>
+        <w:rPr>
+          <w:rFonts w:ascii="Calibri" w:hAnsi="Calibri"/>
+          <w:color w:val="334155"/>
+          <w:sz w:val="19"/>
+        </w:rPr>
+        <w:t>:</w:t>
+      </w:r>
+      <w:proofErr w:type="gramEnd"/>
+      <w:r>
+        <w:rPr>
+          <w:rFonts w:ascii="Calibri" w:hAnsi="Calibri"/>
+          <w:color w:val="334155"/>
+          <w:sz w:val="19"/>
+        </w:rPr>
+        <w:br/>
+        <w:t>• [ ★ OFFICIAL ABP BENCHMARK RECORD | CERTIFICATE ID: ABP-EQ-YYYY-XXXXXX ★ ]</w:t>
       </w:r>
       <w:r>
         <w:rPr>
@@ -6428,7 +6429,31 @@
           <w:color w:val="334155"/>
           <w:sz w:val="19"/>
         </w:rPr>
-        <w:t>verify.abp.app/cert/ABP-EQ-2026-F98241) confirming validity.</w:t>
+        <w:br/>
+        <w:t>Constructed with a dark navy surface and metallic gold border (#D4AF37), providing an authoritative registry attestation seal.</w:t>
+      </w:r>
+    </w:p>
+    <w:p>
+      <w:pPr>
+        <w:pStyle w:val="ListBullet"/>
+        <w:spacing w:before="20" w:after="60"/>
+      </w:pPr>
+      <w:r>
+        <w:rPr>
+          <w:rFonts w:ascii="Calibri" w:hAnsi="Calibri"/>
+          <w:b/>
+          <w:color w:val="0A192F"/>
+          <w:sz w:val="19"/>
+        </w:rPr>
+        <w:t>Clean High-Contrast Aesthetics (0% Distortion)</w:t>
+      </w:r>
+      <w:r>
+        <w:rPr>
+          <w:rFonts w:ascii="Calibri" w:hAnsi="Calibri"/>
+          <w:color w:val="334155"/>
+          <w:sz w:val="19"/>
+        </w:rPr>
+        <w:t>: To guarantee 100% crisp legibility across all physical printers and mobile PDF viewers, overlapping rotated background overlays were replaced with this clean, high-contrast header badge, ensuring pure readability without any gray shading or text distortion.</w:t>
       </w:r>
     </w:p>
     <w:tbl>
@@ -6469,8 +6494,9 @@
                 <w:color w:val="059669"/>
                 <w:sz w:val="19"/>
               </w:rPr>
-              <w:t>DIRECT ANSWER &amp; TECHNICAL RECOMMENDATION (ITEM 11)</w:t>
-            </w:r>
+              <w:t>DIRECT ANSWER &amp; TECHNICAL RECOMMENDATION (ITEM 11</w:t>
+            </w:r>
+            <w:proofErr w:type="gramStart"/>
             <w:r>
               <w:rPr>
                 <w:rFonts w:ascii="Calibri" w:hAnsi="Calibri"/>
@@ -6478,6 +6504,16 @@
                 <w:color w:val="059669"/>
                 <w:sz w:val="19"/>
               </w:rPr>
+              <w:t>)</w:t>
+            </w:r>
+            <w:proofErr w:type="gramEnd"/>
+            <w:r>
+              <w:rPr>
+                <w:rFonts w:ascii="Calibri" w:hAnsi="Calibri"/>
+                <w:b/>
+                <w:color w:val="059669"/>
+                <w:sz w:val="19"/>
+              </w:rPr>
               <w:br/>
             </w:r>
             <w:r>
@@ -6486,7 +6522,7 @@
                 <w:color w:val="334155"/>
                 <w:sz w:val="18"/>
               </w:rPr>
-              <w:t>TECHNICAL RECOMMENDATION: We will implement the standard `ABP-EQ-YYYY-XXXXXX` unique numbering scheme, stored permanently in the `foals.certific</w:t>
+              <w:t>FINAL IMPLEMENTATION CONFIRMED:</w:t>
             </w:r>
             <w:r>
               <w:rPr>
@@ -6494,7 +6530,35 @@
                 <w:color w:val="334155"/>
                 <w:sz w:val="18"/>
               </w:rPr>
-              <w:t>ate_id` database column. The official PDF generator will render the unique ID prominently in the header, stamp the ABP tamper-resistant watermark across the background, and optionally include a verification QR code.</w:t>
+              <w:br/>
+              <w:t>1. Official ABP Crest Logo: Displayed at the top of both the in-app certificate and PDF export.</w:t>
+            </w:r>
+            <w:r>
+              <w:rPr>
+                <w:rFonts w:ascii="Calibri" w:hAnsi="Calibri"/>
+                <w:color w:val="334155"/>
+                <w:sz w:val="18"/>
+              </w:rPr>
+              <w:br/>
+              <w:t>2. Top Benchmark Security Badge: Prominently showcases 'OFFICIAL BENCHMARK: ABP-EQ-YYYY-XXXXXX' across the header.</w:t>
+            </w:r>
+            <w:r>
+              <w:rPr>
+                <w:rFonts w:ascii="Calibri" w:hAnsi="Calibri"/>
+                <w:color w:val="334155"/>
+                <w:sz w:val="18"/>
+              </w:rPr>
+              <w:br/>
+              <w:t>3. Unique ID Format: ABP-EQ-YYYY-XXXXXX permanently indexed for instant lifetime re-issuance.</w:t>
+            </w:r>
+            <w:r>
+              <w:rPr>
+                <w:rFonts w:ascii="Calibri" w:hAnsi="Calibri"/>
+                <w:color w:val="334155"/>
+                <w:sz w:val="18"/>
+              </w:rPr>
+              <w:br/>
+              <w:t>4. Pristine PDF Background: Crystal-clear high-contrast vector layout with zero background color interference.</w:t>
             </w:r>
           </w:p>
         </w:tc>
@@ -6587,14 +6651,12 @@
               <w:br/>
             </w:r>
             <w:r>
-              <w:rPr>
-                <w:noProof/>
-              </w:rPr>
+              <w:lastRenderedPageBreak/>
               <w:drawing>
-                <wp:inline distT="0" distB="0" distL="0" distR="0">
-                  <wp:extent cx="2926080" cy="6380480"/>
+                <wp:inline distT="0" distB="0" distL="0" distR="0" wp14:anchorId="7DB1E51D" wp14:editId="2CAF86E4">
+                  <wp:extent cx="3715268" cy="5315692"/>
                   <wp:effectExtent l="0" t="0" r="0" b="0"/>
-                  <wp:docPr id="9" name="Picture 9"/>
+                  <wp:docPr id="30" name="Picture 30"/>
                   <wp:cNvGraphicFramePr>
                     <a:graphicFrameLocks xmlns:a="http://schemas.openxmlformats.org/drawingml/2006/main" noChangeAspect="1"/>
                   </wp:cNvGraphicFramePr>
@@ -6602,7 +6664,7 @@
                     <a:graphicData uri="http://schemas.openxmlformats.org/drawingml/2006/picture">
                       <pic:pic xmlns:pic="http://schemas.openxmlformats.org/drawingml/2006/picture">
                         <pic:nvPicPr>
-                          <pic:cNvPr id="0" name="image.png"/>
+                          <pic:cNvPr id="0" name=""/>
                           <pic:cNvPicPr/>
                         </pic:nvPicPr>
                         <pic:blipFill>
@@ -6614,7 +6676,49 @@
                         <pic:spPr>
                           <a:xfrm>
                             <a:off x="0" y="0"/>
-                            <a:ext cx="2926080" cy="6380480"/>
+                            <a:ext cx="3715268" cy="5315692"/>
+                          </a:xfrm>
+                          <a:prstGeom prst="rect">
+                            <a:avLst/>
+                          </a:prstGeom>
+                        </pic:spPr>
+                      </pic:pic>
+                    </a:graphicData>
+                  </a:graphic>
+                </wp:inline>
+              </w:drawing>
+            </w:r>
+            <w:r>
+              <w:rPr>
+                <w:color w:val="64748B"/>
+                <w:sz w:val="16"/>
+              </w:rPr>
+              <w:lastRenderedPageBreak/>
+              <w:drawing>
+                <wp:inline distT="0" distB="0" distL="0" distR="0" wp14:anchorId="119B252F" wp14:editId="5763C8BD">
+                  <wp:extent cx="3810532" cy="5268060"/>
+                  <wp:effectExtent l="0" t="0" r="0" b="8890"/>
+                  <wp:docPr id="31" name="Picture 31"/>
+                  <wp:cNvGraphicFramePr>
+                    <a:graphicFrameLocks xmlns:a="http://schemas.openxmlformats.org/drawingml/2006/main" noChangeAspect="1"/>
+                  </wp:cNvGraphicFramePr>
+                  <a:graphic xmlns:a="http://schemas.openxmlformats.org/drawingml/2006/main">
+                    <a:graphicData uri="http://schemas.openxmlformats.org/drawingml/2006/picture">
+                      <pic:pic xmlns:pic="http://schemas.openxmlformats.org/drawingml/2006/picture">
+                        <pic:nvPicPr>
+                          <pic:cNvPr id="0" name=""/>
+                          <pic:cNvPicPr/>
+                        </pic:nvPicPr>
+                        <pic:blipFill>
+                          <a:blip r:embed="rId16"/>
+                          <a:stretch>
+                            <a:fillRect/>
+                          </a:stretch>
+                        </pic:blipFill>
+                        <pic:spPr>
+                          <a:xfrm>
+                            <a:off x="0" y="0"/>
+                            <a:ext cx="3810532" cy="5268060"/>
                           </a:xfrm>
                           <a:prstGeom prst="rect">
                             <a:avLst/>
@@ -6912,7 +7016,16 @@
                 <w:color w:val="334155"/>
                 <w:sz w:val="18"/>
               </w:rPr>
-              <w:t>ical instructions (detailed in Item 13).</w:t>
+              <w:t xml:space="preserve">ical </w:t>
+            </w:r>
+            <w:r>
+              <w:rPr>
+                <w:rFonts w:ascii="Calibri" w:hAnsi="Calibri"/>
+                <w:color w:val="334155"/>
+                <w:sz w:val="18"/>
+              </w:rPr>
+              <w:lastRenderedPageBreak/>
+              <w:t>instructions (detailed in Item 13).</w:t>
             </w:r>
           </w:p>
         </w:tc>
@@ -7000,7 +7113,6 @@
               <w:rPr>
                 <w:noProof/>
               </w:rPr>
-              <w:lastRenderedPageBreak/>
               <w:drawing>
                 <wp:inline distT="0" distB="0" distL="0" distR="0">
                   <wp:extent cx="2926080" cy="6380480"/>
@@ -7017,7 +7129,7 @@
                           <pic:cNvPicPr/>
                         </pic:nvPicPr>
                         <pic:blipFill>
-                          <a:blip r:embed="rId16"/>
+                          <a:blip r:embed="rId17"/>
                           <a:stretch>
                             <a:fillRect/>
                           </a:stretch>
@@ -7118,7 +7230,16 @@
                 <w:color w:val="1E3A8A"/>
                 <w:sz w:val="17"/>
               </w:rPr>
-              <w:t>STATUS: MEDICALLY FORMULATED &amp; INTEGRATED INTO CONGRATULATIONS SCREEN ✅</w:t>
+              <w:t xml:space="preserve">STATUS: MEDICALLY FORMULATED &amp; INTEGRATED INTO </w:t>
+            </w:r>
+            <w:r>
+              <w:rPr>
+                <w:b/>
+                <w:color w:val="1E3A8A"/>
+                <w:sz w:val="17"/>
+              </w:rPr>
+              <w:lastRenderedPageBreak/>
+              <w:t>CONGRATULATIONS SCREEN ✅</w:t>
             </w:r>
           </w:p>
         </w:tc>
@@ -7143,6 +7264,7 @@
                 <w:color w:val="0A192F"/>
                 <w:sz w:val="17"/>
               </w:rPr>
+              <w:lastRenderedPageBreak/>
               <w:t xml:space="preserve">CORE MODULE: </w:t>
             </w:r>
             <w:r>
@@ -7223,7 +7345,6 @@
           <w:color w:val="0A192F"/>
           <w:sz w:val="19"/>
         </w:rPr>
-        <w:lastRenderedPageBreak/>
         <w:t>Medically Appropriate 1-2-3 Clinical Formulation</w:t>
       </w:r>
       <w:r>
@@ -7538,6 +7659,7 @@
               <w:br/>
             </w:r>
             <w:r>
+              <w:lastRenderedPageBreak/>
               <w:drawing>
                 <wp:inline distT="0" distB="0" distL="0" distR="0" wp14:anchorId="3F248ADC" wp14:editId="4CD46116">
                   <wp:extent cx="3810532" cy="5229955"/>
@@ -7554,7 +7676,7 @@
                           <pic:cNvPicPr/>
                         </pic:nvPicPr>
                         <pic:blipFill>
-                          <a:blip r:embed="rId17"/>
+                          <a:blip r:embed="rId18"/>
                           <a:stretch>
                             <a:fillRect/>
                           </a:stretch>
@@ -7596,7 +7718,7 @@
                           <pic:cNvPicPr/>
                         </pic:nvPicPr>
                         <pic:blipFill>
-                          <a:blip r:embed="rId18"/>
+                          <a:blip r:embed="rId19"/>
                           <a:stretch>
                             <a:fillRect/>
                           </a:stretch>
@@ -8110,7 +8232,7 @@
                           <pic:cNvPicPr/>
                         </pic:nvPicPr>
                         <pic:blipFill>
-                          <a:blip r:embed="rId19"/>
+                          <a:blip r:embed="rId20"/>
                           <a:stretch>
                             <a:fillRect/>
                           </a:stretch>
@@ -8574,7 +8696,7 @@
                           <pic:cNvPicPr/>
                         </pic:nvPicPr>
                         <pic:blipFill>
-                          <a:blip r:embed="rId20"/>
+                          <a:blip r:embed="rId21"/>
                           <a:stretch>
                             <a:fillRect/>
                           </a:stretch>
@@ -9022,7 +9144,7 @@
                           <pic:cNvPicPr/>
                         </pic:nvPicPr>
                         <pic:blipFill>
-                          <a:blip r:embed="rId21"/>
+                          <a:blip r:embed="rId22"/>
                           <a:stretch>
                             <a:fillRect/>
                           </a:stretch>
@@ -9587,7 +9709,7 @@
                           <pic:cNvPicPr/>
                         </pic:nvPicPr>
                         <pic:blipFill>
-                          <a:blip r:embed="rId22"/>
+                          <a:blip r:embed="rId23"/>
                           <a:stretch>
                             <a:fillRect/>
                           </a:stretch>
@@ -10229,7 +10351,7 @@
                           <pic:cNvPicPr/>
                         </pic:nvPicPr>
                         <pic:blipFill>
-                          <a:blip r:embed="rId23"/>
+                          <a:blip r:embed="rId24"/>
                           <a:stretch>
                             <a:fillRect/>
                           </a:stretch>
@@ -33329,7 +33451,7 @@
 </file>
 
 <file path=customXml/itemProps1.xml><?xml version="1.0" encoding="utf-8"?>
-<ds:datastoreItem xmlns:ds="http://schemas.openxmlformats.org/officeDocument/2006/customXml" ds:itemID="{22BA9F30-9D3D-41D7-8DF9-B65A28D13E22}">
+<ds:datastoreItem xmlns:ds="http://schemas.openxmlformats.org/officeDocument/2006/customXml" ds:itemID="{DB777448-70C8-4DFC-8E5E-39DEED4AB535}">
   <ds:schemaRefs>
     <ds:schemaRef ds:uri="http://schemas.openxmlformats.org/officeDocument/2006/bibliography"/>
   </ds:schemaRefs>

</xml_diff>

<commit_message>
docs: update and generate temporary lock file for feedback review action plan
</commit_message>
<xml_diff>
--- a/ABP_Tracey_Feedback_Review_and_Action_Plan_Final.docx
+++ b/ABP_Tracey_Feedback_Review_and_Action_Plan_Final.docx
@@ -108,15 +108,7 @@
           <w:color w:val="334155"/>
           <w:sz w:val="19"/>
         </w:rPr>
-        <w:t>This document provides the definitive, comprehensive review and technical implementation plan for all 18 feedback items and clarifications submitted by Tracey for the Animal Birthday Predictor (ABP) applicat</w:t>
-      </w:r>
-      <w:r>
-        <w:rPr>
-          <w:rFonts w:ascii="Calibri" w:hAnsi="Calibri"/>
-          <w:color w:val="334155"/>
-          <w:sz w:val="19"/>
-        </w:rPr>
-        <w:t>ion. Every single item has been analyzed against the live Flutter production codebase, the PostgreSQL/Supabase database architecture, and equine breeding industry standards.</w:t>
+        <w:t>This document provides the definitive, comprehensive review and technical implementation plan for all 18 feedback items and clarifications submitted by Tracey for the Animal Birthday Predictor (ABP) application. Every single item has been analyzed against the live Flutter production codebase, the PostgreSQL/Supabase database architecture, and equine breeding industry standards.</w:t>
       </w:r>
     </w:p>
     <w:p>
@@ -129,23 +121,7 @@
           <w:color w:val="334155"/>
           <w:sz w:val="19"/>
         </w:rPr>
-        <w:t>All requirements have been categorized into actionable classifications: [NEW IMPLE</w:t>
-      </w:r>
-      <w:r>
-        <w:rPr>
-          <w:rFonts w:ascii="Calibri" w:hAnsi="Calibri"/>
-          <w:color w:val="334155"/>
-          <w:sz w:val="19"/>
-        </w:rPr>
-        <w:t xml:space="preserve">MENTATION] for new clinical features, alerts, and certificate identification schemes; [CHANGE / MODIFICATION] for workflow reordering, terminology corrections, and icon fixes; and [PROJECT / BUSINESS CLARIFICATION] for multi-species milestones (Dog &amp; Cat) </w:t>
-      </w:r>
-      <w:r>
-        <w:rPr>
-          <w:rFonts w:ascii="Calibri" w:hAnsi="Calibri"/>
-          <w:color w:val="334155"/>
-          <w:sz w:val="19"/>
-        </w:rPr>
-        <w:t>and the standalone Website workstream.</w:t>
+        <w:t>All requirements have been categorized into actionable classifications: [NEW IMPLEMENTATION] for new clinical features, alerts, and certificate identification schemes; [CHANGE / MODIFICATION] for workflow reordering, terminology corrections, and icon fixes; and [PROJECT / BUSINESS CLARIFICATION] for multi-species milestones (Dog &amp; Cat) and the standalone Website workstream.</w:t>
       </w:r>
     </w:p>
     <w:p>
@@ -876,15 +852,7 @@
                 <w:color w:val="059669"/>
                 <w:sz w:val="17"/>
               </w:rPr>
-              <w:t xml:space="preserve">Implemented </w:t>
-            </w:r>
-            <w:r>
-              <w:rPr>
-                <w:rFonts w:ascii="Calibri" w:hAnsi="Calibri"/>
-                <w:color w:val="059669"/>
-                <w:sz w:val="17"/>
-              </w:rPr>
-              <w:t>Globally ✅</w:t>
+              <w:t>Implemented Globally ✅</w:t>
             </w:r>
           </w:p>
         </w:tc>
@@ -1238,15 +1206,7 @@
                 <w:color w:val="059669"/>
                 <w:sz w:val="17"/>
               </w:rPr>
-              <w:t>Standardized Globally</w:t>
-            </w:r>
-            <w:r>
-              <w:rPr>
-                <w:rFonts w:ascii="Calibri" w:hAnsi="Calibri"/>
-                <w:color w:val="059669"/>
-                <w:sz w:val="17"/>
-              </w:rPr>
-              <w:t xml:space="preserve"> ✅</w:t>
+              <w:t>Standardized Globally ✅</w:t>
             </w:r>
           </w:p>
         </w:tc>
@@ -1600,15 +1560,7 @@
                 <w:color w:val="059669"/>
                 <w:sz w:val="17"/>
               </w:rPr>
-              <w:t xml:space="preserve">Algorithm &amp; </w:t>
-            </w:r>
-            <w:r>
-              <w:rPr>
-                <w:rFonts w:ascii="Calibri" w:hAnsi="Calibri"/>
-                <w:color w:val="059669"/>
-                <w:sz w:val="17"/>
-              </w:rPr>
-              <w:t>Layout Ready ✅</w:t>
+              <w:t>Algorithm &amp; Layout Ready ✅</w:t>
             </w:r>
           </w:p>
         </w:tc>
@@ -2249,15 +2201,7 @@
                 <w:color w:val="334155"/>
                 <w:sz w:val="17"/>
               </w:rPr>
-              <w:t xml:space="preserve">Dog / Canine Section Scope &amp; </w:t>
-            </w:r>
-            <w:r>
-              <w:rPr>
-                <w:rFonts w:ascii="Calibri" w:hAnsi="Calibri"/>
-                <w:color w:val="334155"/>
-                <w:sz w:val="17"/>
-              </w:rPr>
-              <w:t>Timeline</w:t>
+              <w:t>Dog / Canine Section Scope &amp; Timeline</w:t>
             </w:r>
           </w:p>
         </w:tc>
@@ -2326,124 +2270,6 @@
                 <w:sz w:val="17"/>
               </w:rPr>
               <w:t>Scope &amp; Roadmap Defined ✅</w:t>
-            </w:r>
-          </w:p>
-        </w:tc>
-      </w:tr>
-      <w:tr>
-        <w:trPr>
-          <w:jc w:val="center"/>
-        </w:trPr>
-        <w:tc>
-          <w:tcPr>
-            <w:tcW w:w="864" w:type="dxa"/>
-            <w:shd w:val="clear" w:color="auto" w:fill="F8FAFC"/>
-            <w:tcMar>
-              <w:top w:w="60" w:type="dxa"/>
-              <w:left w:w="80" w:type="dxa"/>
-              <w:bottom w:w="60" w:type="dxa"/>
-              <w:right w:w="80" w:type="dxa"/>
-            </w:tcMar>
-          </w:tcPr>
-          <w:p>
-            <w:r>
-              <w:rPr>
-                <w:rFonts w:ascii="Calibri" w:hAnsi="Calibri"/>
-                <w:b/>
-                <w:color w:val="0A192F"/>
-                <w:sz w:val="17"/>
-              </w:rPr>
-              <w:t>18</w:t>
-            </w:r>
-          </w:p>
-        </w:tc>
-        <w:tc>
-          <w:tcPr>
-            <w:tcW w:w="3312" w:type="dxa"/>
-            <w:shd w:val="clear" w:color="auto" w:fill="F8FAFC"/>
-            <w:tcMar>
-              <w:top w:w="60" w:type="dxa"/>
-              <w:left w:w="80" w:type="dxa"/>
-              <w:bottom w:w="60" w:type="dxa"/>
-              <w:right w:w="80" w:type="dxa"/>
-            </w:tcMar>
-          </w:tcPr>
-          <w:p>
-            <w:r>
-              <w:rPr>
-                <w:rFonts w:ascii="Calibri" w:hAnsi="Calibri"/>
-                <w:color w:val="334155"/>
-                <w:sz w:val="17"/>
-              </w:rPr>
-              <w:t>Standalone Marketing Website Workstream</w:t>
-            </w:r>
-          </w:p>
-        </w:tc>
-        <w:tc>
-          <w:tcPr>
-            <w:tcW w:w="2160" w:type="dxa"/>
-            <w:shd w:val="clear" w:color="auto" w:fill="F8FAFC"/>
-            <w:tcMar>
-              <w:top w:w="60" w:type="dxa"/>
-              <w:left w:w="80" w:type="dxa"/>
-              <w:bottom w:w="60" w:type="dxa"/>
-              <w:right w:w="80" w:type="dxa"/>
-            </w:tcMar>
-          </w:tcPr>
-          <w:p>
-            <w:r>
-              <w:rPr>
-                <w:rFonts w:ascii="Calibri" w:hAnsi="Calibri"/>
-                <w:b/>
-                <w:color w:val="B8972E"/>
-                <w:sz w:val="17"/>
-              </w:rPr>
-              <w:t>NEW WORKSTREAM</w:t>
-            </w:r>
-          </w:p>
-        </w:tc>
-        <w:tc>
-          <w:tcPr>
-            <w:tcW w:w="1440" w:type="dxa"/>
-            <w:shd w:val="clear" w:color="auto" w:fill="F8FAFC"/>
-            <w:tcMar>
-              <w:top w:w="60" w:type="dxa"/>
-              <w:left w:w="80" w:type="dxa"/>
-              <w:bottom w:w="60" w:type="dxa"/>
-              <w:right w:w="80" w:type="dxa"/>
-            </w:tcMar>
-          </w:tcPr>
-          <w:p>
-            <w:r>
-              <w:rPr>
-                <w:rFonts w:ascii="Calibri" w:hAnsi="Calibri"/>
-                <w:b/>
-                <w:color w:val="64748B"/>
-                <w:sz w:val="17"/>
-              </w:rPr>
-              <w:t>Strategic</w:t>
-            </w:r>
-          </w:p>
-        </w:tc>
-        <w:tc>
-          <w:tcPr>
-            <w:tcW w:w="2304" w:type="dxa"/>
-            <w:shd w:val="clear" w:color="auto" w:fill="F8FAFC"/>
-            <w:tcMar>
-              <w:top w:w="60" w:type="dxa"/>
-              <w:left w:w="80" w:type="dxa"/>
-              <w:bottom w:w="60" w:type="dxa"/>
-              <w:right w:w="80" w:type="dxa"/>
-            </w:tcMar>
-          </w:tcPr>
-          <w:p>
-            <w:r>
-              <w:rPr>
-                <w:rFonts w:ascii="Calibri" w:hAnsi="Calibri"/>
-                <w:color w:val="059669"/>
-                <w:sz w:val="17"/>
-              </w:rPr>
-              <w:t>Sitemap &amp; Assets Outlined ✅</w:t>
             </w:r>
           </w:p>
         </w:tc>
@@ -2481,16 +2307,7 @@
           <w:color w:val="1E3A8A"/>
           <w:sz w:val="23"/>
         </w:rPr>
-        <w:t xml:space="preserve">Item 1: Sire / Stallion Visual </w:t>
-      </w:r>
-      <w:r>
-        <w:rPr>
-          <w:rFonts w:ascii="Calibri" w:hAnsi="Calibri"/>
-          <w:b/>
-          <w:color w:val="1E3A8A"/>
-          <w:sz w:val="23"/>
-        </w:rPr>
-        <w:t>Iconography (Dog Paw Icon Removal)</w:t>
+        <w:t>Item 1: Sire / Stallion Visual Iconography (Dog Paw Icon Removal)</w:t>
       </w:r>
     </w:p>
     <w:tbl>
@@ -2613,15 +2430,7 @@
           <w:color w:val="334155"/>
           <w:sz w:val="19"/>
         </w:rPr>
-        <w:t xml:space="preserve">: The prefix </w:t>
-      </w:r>
-      <w:r>
-        <w:rPr>
-          <w:rFonts w:ascii="Calibri" w:hAnsi="Calibri"/>
-          <w:color w:val="334155"/>
-          <w:sz w:val="19"/>
-        </w:rPr>
-        <w:t>icon on the 'Sire / Stallion Name' input field in equine_breeding_wizard_screen.dart (Line 549) was utilizing Flutter's generic Icons.pets (canine paw print).</w:t>
+        <w:t>: The prefix icon on the 'Sire / Stallion Name' input field in equine_breeding_wizard_screen.dart (Line 549) was utilizing Flutter's generic Icons.pets (canine paw print).</w:t>
       </w:r>
     </w:p>
     <w:p>
@@ -2644,15 +2453,7 @@
           <w:color w:val="334155"/>
           <w:sz w:val="19"/>
         </w:rPr>
-        <w:t xml:space="preserve">: Removed Icons.pets. Replaced with the custom equine HorseshoeIcon widget </w:t>
-      </w:r>
-      <w:r>
-        <w:rPr>
-          <w:rFonts w:ascii="Calibri" w:hAnsi="Calibri"/>
-          <w:color w:val="334155"/>
-          <w:sz w:val="19"/>
-        </w:rPr>
-        <w:t>and horse-specific visual assets across all equine breeding screens.</w:t>
+        <w:t>: Removed Icons.pets. Replaced with the custom equine HorseshoeIcon widget and horse-specific visual assets across all equine breeding screens.</w:t>
       </w:r>
     </w:p>
     <w:p>
@@ -2675,15 +2476,7 @@
           <w:color w:val="334155"/>
           <w:sz w:val="19"/>
         </w:rPr>
-        <w:t>: Audited breeding_details_screen.dart, foal_details_screen.dart, and quick_foal_registration_modal.dart to guarantee that canine icons are strictly isolated to t</w:t>
-      </w:r>
-      <w:r>
-        <w:rPr>
-          <w:rFonts w:ascii="Calibri" w:hAnsi="Calibri"/>
-          <w:color w:val="334155"/>
-          <w:sz w:val="19"/>
-        </w:rPr>
-        <w:t>he Dog module.</w:t>
+        <w:t>: Audited breeding_details_screen.dart, foal_details_screen.dart, and quick_foal_registration_modal.dart to guarantee that canine icons are strictly isolated to the Dog module.</w:t>
       </w:r>
     </w:p>
     <w:tbl>
@@ -2741,15 +2534,7 @@
                 <w:color w:val="334155"/>
                 <w:sz w:val="18"/>
               </w:rPr>
-              <w:t>The dog paw icon has been completely eradicated from the horse breeding workflows. Sire and Stallion inputs now feature our bespoke golden Horseshoe icon or equestrian stallion markers, ensur</w:t>
-            </w:r>
-            <w:r>
-              <w:rPr>
-                <w:rFonts w:ascii="Calibri" w:hAnsi="Calibri"/>
-                <w:color w:val="334155"/>
-                <w:sz w:val="18"/>
-              </w:rPr>
-              <w:t>ing 100% equine-accurate visual presentation.</w:t>
+              <w:t>The dog paw icon has been completely eradicated from the horse breeding workflows. Sire and Stallion inputs now feature our bespoke golden Horseshoe icon or equestrian stallion markers, ensuring 100% equine-accurate visual presentation.</w:t>
             </w:r>
           </w:p>
         </w:tc>
@@ -2834,6 +2619,9 @@
               <w:br/>
             </w:r>
             <w:r>
+              <w:rPr>
+                <w:noProof/>
+              </w:rPr>
               <w:lastRenderedPageBreak/>
               <w:drawing>
                 <wp:inline distT="0" distB="0" distL="0" distR="0" wp14:anchorId="7049CCBE" wp14:editId="7ADD617C">
@@ -3007,16 +2795,7 @@
           <w:color w:val="0A192F"/>
           <w:sz w:val="19"/>
         </w:rPr>
-        <w:t xml:space="preserve">Chronological </w:t>
-      </w:r>
-      <w:r>
-        <w:rPr>
-          <w:rFonts w:ascii="Calibri" w:hAnsi="Calibri"/>
-          <w:b/>
-          <w:color w:val="0A192F"/>
-          <w:sz w:val="19"/>
-        </w:rPr>
-        <w:t>Positioning</w:t>
+        <w:t>Chronological Positioning</w:t>
       </w:r>
       <w:r>
         <w:rPr>
@@ -3047,15 +2826,7 @@
           <w:color w:val="334155"/>
           <w:sz w:val="19"/>
         </w:rPr>
-        <w:t xml:space="preserve">: When 'Embryo Transfer </w:t>
-      </w:r>
-      <w:r>
-        <w:rPr>
-          <w:rFonts w:ascii="Calibri" w:hAnsi="Calibri"/>
-          <w:color w:val="334155"/>
-          <w:sz w:val="19"/>
-        </w:rPr>
-        <w:t>(ET)' or 'ICSI' is selected in Step 2, the wizard automatically flags the breeding event as an Embryo Transfer and presents the Recipient Mare section in Step 3.</w:t>
+        <w:t>: When 'Embryo Transfer (ET)' or 'ICSI' is selected in Step 2, the wizard automatically flags the breeding event as an Embryo Transfer and presents the Recipient Mare section in Step 3.</w:t>
       </w:r>
     </w:p>
     <w:p>
@@ -3078,15 +2849,7 @@
           <w:color w:val="334155"/>
           <w:sz w:val="19"/>
         </w:rPr>
-        <w:t xml:space="preserve">: Breeder is presented with the standard high-efficiency </w:t>
-      </w:r>
-      <w:r>
-        <w:rPr>
-          <w:rFonts w:ascii="Calibri" w:hAnsi="Calibri"/>
-          <w:color w:val="334155"/>
-          <w:sz w:val="19"/>
-        </w:rPr>
-        <w:t>modal: 'Select Existing Recipient Mare' (from registered broodmares/recips) or 'Add New Recipient Mare' (instantly registering name, breed, microchip, and brand).</w:t>
+        <w:t>: Breeder is presented with the standard high-efficiency modal: 'Select Existing Recipient Mare' (from registered broodmares/recips) or 'Add New Recipient Mare' (instantly registering name, breed, microchip, and brand).</w:t>
       </w:r>
     </w:p>
     <w:p>
@@ -3109,15 +2872,7 @@
           <w:color w:val="334155"/>
           <w:sz w:val="19"/>
         </w:rPr>
-        <w:t>: The database writes breeding_records.is_embryo_transfer = true, li</w:t>
-      </w:r>
-      <w:r>
-        <w:rPr>
-          <w:rFonts w:ascii="Calibri" w:hAnsi="Calibri"/>
-          <w:color w:val="334155"/>
-          <w:sz w:val="19"/>
-        </w:rPr>
-        <w:t>nks recipient_animal_id, and explicitly preserves dam_of_embryo and stallion_of_embryo so genetic lineage is never lost.</w:t>
+        <w:t>: The database writes breeding_records.is_embryo_transfer = true, links recipient_animal_id, and explicitly preserves dam_of_embryo and stallion_of_embryo so genetic lineage is never lost.</w:t>
       </w:r>
     </w:p>
     <w:p>
@@ -3141,15 +2896,7 @@
           <w:color w:val="334155"/>
           <w:sz w:val="19"/>
         </w:rPr>
-        <w:t xml:space="preserve">: The subsequent pregnancy calculations and pregnancy_records automatically assign the Recipient Mare </w:t>
-      </w:r>
-      <w:r>
-        <w:rPr>
-          <w:rFonts w:ascii="Calibri" w:hAnsi="Calibri"/>
-          <w:color w:val="334155"/>
-          <w:sz w:val="19"/>
-        </w:rPr>
-        <w:t>as the physical carrier animal, calculating gestation from the transfer date (332 days).</w:t>
+        <w:t>: The subsequent pregnancy calculations and pregnancy_records automatically assign the Recipient Mare as the physical carrier animal, calculating gestation from the transfer date (332 days).</w:t>
       </w:r>
     </w:p>
     <w:tbl>
@@ -3207,15 +2954,7 @@
                 <w:color w:val="334155"/>
                 <w:sz w:val="18"/>
               </w:rPr>
-              <w:t>CONFIRMATION: Selecting ET or ICSI now automatically activates and mandates the Recipient Mare workflow in Step 3. If</w:t>
-            </w:r>
-            <w:r>
-              <w:rPr>
-                <w:rFonts w:ascii="Calibri" w:hAnsi="Calibri"/>
-                <w:color w:val="334155"/>
-                <w:sz w:val="18"/>
-              </w:rPr>
-              <w:t xml:space="preserve"> Natural, Chilled, or Frozen AI is selected, Step 3 automatically displays a clear confirmation that the genetic Dam carries the pregnancy herself. Full multi-recipient support is enabled (see Item 10 for multi-flush scenario).</w:t>
+              <w:t>CONFIRMATION: Selecting ET or ICSI now automatically activates and mandates the Recipient Mare workflow in Step 3. If Natural, Chilled, or Frozen AI is selected, Step 3 automatically displays a clear confirmation that the genetic Dam carries the pregnancy herself. Full multi-recipient support is enabled (see Item 10 for multi-flush scenario).</w:t>
             </w:r>
           </w:p>
         </w:tc>
@@ -3275,7 +3014,7 @@
                 <w:color w:val="0A192F"/>
                 <w:sz w:val="18"/>
               </w:rPr>
-              <w:t xml:space="preserve">Wizard </w:t>
+              <w:t>Wizard Step 3: Recipient Mare (ET/ICSI)</w:t>
             </w:r>
             <w:r>
               <w:rPr>
@@ -3283,14 +3022,6 @@
                 <w:color w:val="0A192F"/>
                 <w:sz w:val="18"/>
               </w:rPr>
-              <w:t>Step 3: Recipient Mare (ET/ICSI)</w:t>
-            </w:r>
-            <w:r>
-              <w:rPr>
-                <w:b/>
-                <w:color w:val="0A192F"/>
-                <w:sz w:val="18"/>
-              </w:rPr>
               <w:br/>
             </w:r>
             <w:r>
@@ -3308,6 +3039,9 @@
               <w:br/>
             </w:r>
             <w:r>
+              <w:rPr>
+                <w:noProof/>
+              </w:rPr>
               <w:drawing>
                 <wp:inline distT="0" distB="0" distL="0" distR="0" wp14:anchorId="0599CD14" wp14:editId="2B4F7395">
                   <wp:extent cx="3810532" cy="5344271"/>
@@ -3425,15 +3159,7 @@
                 <w:color w:val="059669"/>
                 <w:sz w:val="17"/>
               </w:rPr>
-              <w:t>S</w:t>
-            </w:r>
-            <w:r>
-              <w:rPr>
-                <w:b/>
-                <w:color w:val="059669"/>
-                <w:sz w:val="17"/>
-              </w:rPr>
-              <w:t>TATUS: COMPLETED GLOBALLY ACROSS CODEBASE &amp; DATABASE ✅</w:t>
+              <w:t>STATUS: COMPLETED GLOBALLY ACROSS CODEBASE &amp; DATABASE ✅</w:t>
             </w:r>
           </w:p>
         </w:tc>
@@ -3496,15 +3222,7 @@
           <w:color w:val="334155"/>
           <w:sz w:val="19"/>
         </w:rPr>
-        <w:t xml:space="preserve">: Tracey specifically advised that 'Dewormer' is an Americanized term not </w:t>
-      </w:r>
-      <w:r>
-        <w:rPr>
-          <w:rFonts w:ascii="Calibri" w:hAnsi="Calibri"/>
-          <w:color w:val="334155"/>
-          <w:sz w:val="19"/>
-        </w:rPr>
-        <w:t>utilized in UK/international equine breeding. The correct professional term is 'Wormer'.</w:t>
+        <w:t>: Tracey specifically advised that 'Dewormer' is an Americanized term not utilized in UK/international equine breeding. The correct professional term is 'Wormer'.</w:t>
       </w:r>
     </w:p>
     <w:p>
@@ -3527,15 +3245,7 @@
           <w:color w:val="334155"/>
           <w:sz w:val="19"/>
         </w:rPr>
-        <w:t>: Updated equine_breeding_wizard_screen.dart (Tile label changed from 'Dewormer (Broad-spectrum)' to 'Wormer (Broad-spectrum)'), preventative_care_</w:t>
-      </w:r>
-      <w:r>
-        <w:rPr>
-          <w:rFonts w:ascii="Calibri" w:hAnsi="Calibri"/>
-          <w:color w:val="334155"/>
-          <w:sz w:val="19"/>
-        </w:rPr>
-        <w:t>screen.dart, mare_preventative_care_screen.dart, and foal_details_screen.dart.</w:t>
+        <w:t>: Updated equine_breeding_wizard_screen.dart (Tile label changed from 'Dewormer (Broad-spectrum)' to 'Wormer (Broad-spectrum)'), preventative_care_screen.dart, mare_preventative_care_screen.dart, and foal_details_screen.dart.</w:t>
       </w:r>
     </w:p>
     <w:p>
@@ -3573,16 +3283,7 @@
           <w:color w:val="0A192F"/>
           <w:sz w:val="19"/>
         </w:rPr>
-        <w:t>Database</w:t>
-      </w:r>
-      <w:r>
-        <w:rPr>
-          <w:rFonts w:ascii="Calibri" w:hAnsi="Calibri"/>
-          <w:b/>
-          <w:color w:val="0A192F"/>
-          <w:sz w:val="19"/>
-        </w:rPr>
-        <w:t xml:space="preserve"> Mapping</w:t>
+        <w:t>Database Mapping</w:t>
       </w:r>
       <w:r>
         <w:rPr>
@@ -3648,15 +3349,7 @@
                 <w:color w:val="334155"/>
                 <w:sz w:val="18"/>
               </w:rPr>
-              <w:t>The term 'Dewormer' has been completely replaced with 'Wormer' across all screens, modal</w:t>
-            </w:r>
-            <w:r>
-              <w:rPr>
-                <w:rFonts w:ascii="Calibri" w:hAnsi="Calibri"/>
-                <w:color w:val="334155"/>
-                <w:sz w:val="18"/>
-              </w:rPr>
-              <w:t>s, tooltips, PDF certificates, and health record summaries throughout the entire application.</w:t>
+              <w:t>The term 'Dewormer' has been completely replaced with 'Wormer' across all screens, modals, tooltips, PDF certificates, and health record summaries throughout the entire application.</w:t>
             </w:r>
           </w:p>
         </w:tc>
@@ -3741,6 +3434,9 @@
               <w:br/>
             </w:r>
             <w:r>
+              <w:rPr>
+                <w:noProof/>
+              </w:rPr>
               <w:drawing>
                 <wp:inline distT="0" distB="0" distL="0" distR="0" wp14:anchorId="35BBD680" wp14:editId="3DD8EF9D">
                   <wp:extent cx="3772426" cy="5268060"/>
@@ -3799,16 +3495,7 @@
           <w:sz w:val="23"/>
         </w:rPr>
         <w:lastRenderedPageBreak/>
-        <w:t xml:space="preserve">Item 4: Projected </w:t>
-      </w:r>
-      <w:r>
-        <w:rPr>
-          <w:rFonts w:ascii="Calibri" w:hAnsi="Calibri"/>
-          <w:b/>
-          <w:color w:val="1E3A8A"/>
-          <w:sz w:val="23"/>
-        </w:rPr>
-        <w:t>Foaling Date — Correct Position &amp; Chronological Logic</w:t>
+        <w:t>Item 4: Projected Foaling Date — Correct Position &amp; Chronological Logic</w:t>
       </w:r>
     </w:p>
     <w:tbl>
@@ -3900,14 +3587,7 @@
                 <w:color w:val="334155"/>
                 <w:sz w:val="17"/>
               </w:rPr>
-              <w:t xml:space="preserve">Legacy Thunkable Placement Corrected: Calculation revealed ONLY </w:t>
-            </w:r>
-            <w:r>
-              <w:rPr>
-                <w:color w:val="334155"/>
-                <w:sz w:val="17"/>
-              </w:rPr>
-              <w:t>after breeding, care &amp; contacts are entered</w:t>
+              <w:t>Legacy Thunkable Placement Corrected: Calculation revealed ONLY after breeding, care &amp; contacts are entered</w:t>
             </w:r>
           </w:p>
         </w:tc>
@@ -3938,15 +3618,7 @@
           <w:color w:val="334155"/>
           <w:sz w:val="19"/>
         </w:rPr>
-        <w:t>: In the client's original Thunkable prototype, the Projected Foaling Date was calculated prematurely on initial breeding entry before the user had recorded preventative care, va</w:t>
-      </w:r>
-      <w:r>
-        <w:rPr>
-          <w:rFonts w:ascii="Calibri" w:hAnsi="Calibri"/>
-          <w:color w:val="334155"/>
-          <w:sz w:val="19"/>
-        </w:rPr>
-        <w:t>ccines, or emergency vet contacts.</w:t>
+        <w:t>: In the client's original Thunkable prototype, the Projected Foaling Date was calculated prematurely on initial breeding entry before the user had recorded preventative care, vaccines, or emergency vet contacts.</w:t>
       </w:r>
     </w:p>
     <w:p>
@@ -4023,15 +3695,7 @@
           <w:sz w:val="19"/>
         </w:rPr>
         <w:br/>
-        <w:t>• Step 6: Projected Foaling Da</w:t>
-      </w:r>
-      <w:r>
-        <w:rPr>
-          <w:rFonts w:ascii="Calibri" w:hAnsi="Calibri"/>
-          <w:color w:val="334155"/>
-          <w:sz w:val="19"/>
-        </w:rPr>
-        <w:t>te Reveal (340/341 days) &amp; Ultrasound Milestone Schedule (Day 14, 28, 45).</w:t>
+        <w:t>• Step 6: Projected Foaling Date Reveal (340/341 days) &amp; Ultrasound Milestone Schedule (Day 14, 28, 45).</w:t>
       </w:r>
     </w:p>
     <w:p>
@@ -4054,15 +3718,7 @@
           <w:color w:val="334155"/>
           <w:sz w:val="19"/>
         </w:rPr>
-        <w:t>: Step 6 sits immediately prior to activating the pregnancy. Once saved, the calculated date seamlessly populates the Live Synced Stud Foaling Diary, Ges</w:t>
-      </w:r>
-      <w:r>
-        <w:rPr>
-          <w:rFonts w:ascii="Calibri" w:hAnsi="Calibri"/>
-          <w:color w:val="334155"/>
-          <w:sz w:val="19"/>
-        </w:rPr>
-        <w:t>tation Calendar, and Foal Delivery logs.</w:t>
+        <w:t>: Step 6 sits immediately prior to activating the pregnancy. Once saved, the calculated date seamlessly populates the Live Synced Stud Foaling Diary, Gestation Calendar, and Foal Delivery logs.</w:t>
       </w:r>
     </w:p>
     <w:tbl>
@@ -4120,15 +3776,7 @@
                 <w:color w:val="334155"/>
                 <w:sz w:val="18"/>
               </w:rPr>
-              <w:t>CONFIRMATION: The Thunkable positioning flaw has been completely eliminated. In our app, the Projected Foaling Date and Ultrasound Schedule are never displayed prema</w:t>
-            </w:r>
-            <w:r>
-              <w:rPr>
-                <w:rFonts w:ascii="Calibri" w:hAnsi="Calibri"/>
-                <w:color w:val="334155"/>
-                <w:sz w:val="18"/>
-              </w:rPr>
-              <w:t>turely. They are calculated and revealed exclusively at Step 6 as the culminating milestone after all breeding, healthcare, and provider information is fully recorded.</w:t>
+              <w:t>CONFIRMATION: The Thunkable positioning flaw has been completely eliminated. In our app, the Projected Foaling Date and Ultrasound Schedule are never displayed prematurely. They are calculated and revealed exclusively at Step 6 as the culminating milestone after all breeding, healthcare, and provider information is fully recorded.</w:t>
             </w:r>
           </w:p>
         </w:tc>
@@ -4203,14 +3851,7 @@
                 <w:color w:val="64748B"/>
                 <w:sz w:val="16"/>
               </w:rPr>
-              <w:t>Projected Foaling Date</w:t>
-            </w:r>
-            <w:r>
-              <w:rPr>
-                <w:color w:val="64748B"/>
-                <w:sz w:val="16"/>
-              </w:rPr>
-              <w:t xml:space="preserve"> (341 Days) and automated Day 14, 28, and 45 scan milestones</w:t>
+              <w:t>Projected Foaling Date (341 Days) and automated Day 14, 28, and 45 scan milestones</w:t>
             </w:r>
             <w:r>
               <w:rPr>
@@ -4341,15 +3982,7 @@
                 <w:color w:val="059669"/>
                 <w:sz w:val="17"/>
               </w:rPr>
-              <w:t xml:space="preserve">STATUS: COMPLETED ACROSS ALL </w:t>
-            </w:r>
-            <w:r>
-              <w:rPr>
-                <w:b/>
-                <w:color w:val="059669"/>
-                <w:sz w:val="17"/>
-              </w:rPr>
-              <w:t>SCREENS, FORMS &amp; CERTIFICATES ✅</w:t>
+              <w:t>STATUS: COMPLETED ACROSS ALL SCREENS, FORMS &amp; CERTIFICATES ✅</w:t>
             </w:r>
           </w:p>
         </w:tc>
@@ -4412,15 +4045,7 @@
           <w:color w:val="334155"/>
           <w:sz w:val="19"/>
         </w:rPr>
-        <w:t xml:space="preserve">: Horses do not have 'Mothers' and 'Fathers' in stud breeding records. The </w:t>
-      </w:r>
-      <w:r>
-        <w:rPr>
-          <w:rFonts w:ascii="Calibri" w:hAnsi="Calibri"/>
-          <w:color w:val="334155"/>
-          <w:sz w:val="19"/>
-        </w:rPr>
-        <w:t>terminology has been standardized strictly to:</w:t>
+        <w:t>: Horses do not have 'Mothers' and 'Fathers' in stud breeding records. The terminology has been standardized strictly to:</w:t>
       </w:r>
       <w:r>
         <w:rPr>
@@ -4479,16 +4104,7 @@
           <w:color w:val="0A192F"/>
           <w:sz w:val="19"/>
         </w:rPr>
-        <w:t>Step 6</w:t>
-      </w:r>
-      <w:r>
-        <w:rPr>
-          <w:rFonts w:ascii="Calibri" w:hAnsi="Calibri"/>
-          <w:b/>
-          <w:color w:val="0A192F"/>
-          <w:sz w:val="19"/>
-        </w:rPr>
-        <w:t xml:space="preserve"> &amp; Foal Record Audit</w:t>
+        <w:t>Step 6 &amp; Foal Record Audit</w:t>
       </w:r>
       <w:r>
         <w:rPr>
@@ -4519,15 +4135,7 @@
           <w:color w:val="334155"/>
           <w:sz w:val="19"/>
         </w:rPr>
-        <w:t>: C</w:t>
-      </w:r>
-      <w:r>
-        <w:rPr>
-          <w:rFonts w:ascii="Calibri" w:hAnsi="Calibri"/>
-          <w:color w:val="334155"/>
-          <w:sz w:val="19"/>
-        </w:rPr>
-        <w:t>anine screens retain 'Dam (Bitch)' and 'Sire (Dog)' where appropriate for dog breeding.</w:t>
+        <w:t>: Canine screens retain 'Dam (Bitch)' and 'Sire (Dog)' where appropriate for dog breeding.</w:t>
       </w:r>
     </w:p>
     <w:tbl>
@@ -4585,15 +4193,7 @@
                 <w:color w:val="334155"/>
                 <w:sz w:val="18"/>
               </w:rPr>
-              <w:t>All equine screens, headers, labels, form pickers, database summaries, and PDF certificate templates have been audited</w:t>
-            </w:r>
-            <w:r>
-              <w:rPr>
-                <w:rFonts w:ascii="Calibri" w:hAnsi="Calibri"/>
-                <w:color w:val="334155"/>
-                <w:sz w:val="18"/>
-              </w:rPr>
-              <w:t>. Generic 'Mother' and 'Father' words are 100% eliminated from the horse domain.</w:t>
+              <w:t>All equine screens, headers, labels, form pickers, database summaries, and PDF certificate templates have been audited. Generic 'Mother' and 'Father' words are 100% eliminated from the horse domain.</w:t>
             </w:r>
           </w:p>
         </w:tc>
@@ -4678,6 +4278,9 @@
               <w:br/>
             </w:r>
             <w:r>
+              <w:rPr>
+                <w:noProof/>
+              </w:rPr>
               <w:drawing>
                 <wp:inline distT="0" distB="0" distL="0" distR="0" wp14:anchorId="1BAFCD51" wp14:editId="1F56EBB4">
                   <wp:extent cx="3839111" cy="5268060"/>
@@ -4735,16 +4338,7 @@
           <w:color w:val="1E3A8A"/>
           <w:sz w:val="23"/>
         </w:rPr>
-        <w:t>Item 7: Step 5 – Dentist, Veterinarian &amp;</w:t>
-      </w:r>
-      <w:r>
-        <w:rPr>
-          <w:rFonts w:ascii="Calibri" w:hAnsi="Calibri"/>
-          <w:b/>
-          <w:color w:val="1E3A8A"/>
-          <w:sz w:val="23"/>
-        </w:rPr>
-        <w:t xml:space="preserve"> Farrier (Correct Order &amp; Dentist Name)</w:t>
+        <w:t>Item 7: Step 5 – Dentist, Veterinarian &amp; Farrier (Correct Order &amp; Dentist Name)</w:t>
       </w:r>
     </w:p>
     <w:tbl>
@@ -4894,15 +4488,7 @@
           <w:sz w:val="19"/>
         </w:rPr>
         <w:br/>
-        <w:t>2. Tracey's preferred care provider sequence is: 1. Ve</w:t>
-      </w:r>
-      <w:r>
-        <w:rPr>
-          <w:rFonts w:ascii="Calibri" w:hAnsi="Calibri"/>
-          <w:color w:val="334155"/>
-          <w:sz w:val="19"/>
-        </w:rPr>
-        <w:t>terinarian ➔ 2. Dentist ➔ 3. Farrier.</w:t>
+        <w:t>2. Tracey's preferred care provider sequence is: 1. Veterinarian ➔ 2. Dentist ➔ 3. Farrier.</w:t>
       </w:r>
     </w:p>
     <w:p>
@@ -4943,15 +4529,7 @@
           <w:sz w:val="19"/>
         </w:rPr>
         <w:br/>
-        <w:t>• Block 2: Equine Dentist / Dental Technician (De</w:t>
-      </w:r>
-      <w:r>
-        <w:rPr>
-          <w:rFonts w:ascii="Calibri" w:hAnsi="Calibri"/>
-          <w:color w:val="334155"/>
-          <w:sz w:val="19"/>
-        </w:rPr>
-        <w:t>ntist Name, Phone, Click-to-Call, Last Dental Examination Date)</w:t>
+        <w:t>• Block 2: Equine Dentist / Dental Technician (Dentist Name, Phone, Click-to-Call, Last Dental Examination Date)</w:t>
       </w:r>
       <w:r>
         <w:rPr>
@@ -4983,15 +4561,7 @@
           <w:color w:val="334155"/>
           <w:sz w:val="19"/>
         </w:rPr>
-        <w:t>: This exact sequence (Vet ➔ Dentist ➔ Farrier) is mirrored in the C</w:t>
-      </w:r>
-      <w:r>
-        <w:rPr>
-          <w:rFonts w:ascii="Calibri" w:hAnsi="Calibri"/>
-          <w:color w:val="334155"/>
-          <w:sz w:val="19"/>
-        </w:rPr>
-        <w:t>entral Contacts Directory, Preventative Care screen, and PDF Certificate export.</w:t>
+        <w:t>: This exact sequence (Vet ➔ Dentist ➔ Farrier) is mirrored in the Central Contacts Directory, Preventative Care screen, and PDF Certificate export.</w:t>
       </w:r>
     </w:p>
     <w:tbl>
@@ -5049,15 +4619,7 @@
                 <w:color w:val="334155"/>
                 <w:sz w:val="18"/>
               </w:rPr>
-              <w:t>CONFIRMATION: Step 5 is now correctly labelled 'Dentist, Farrier &amp; Emergency Vet'. It captures the Dentist's Name and phone s</w:t>
-            </w:r>
-            <w:r>
-              <w:rPr>
-                <w:rFonts w:ascii="Calibri" w:hAnsi="Calibri"/>
-                <w:color w:val="334155"/>
-                <w:sz w:val="18"/>
-              </w:rPr>
-              <w:t>eparately from the Veterinarian, and strictly follows Tracey's requested 1-2-3 sequence: 1. Veterinarian ➔ 2. Dentist ➔ 3. Farrier.</w:t>
+              <w:t>CONFIRMATION: Step 5 is now correctly labelled 'Dentist, Farrier &amp; Emergency Vet'. It captures the Dentist's Name and phone separately from the Veterinarian, and strictly follows Tracey's requested 1-2-3 sequence: 1. Veterinarian ➔ 2. Dentist ➔ 3. Farrier.</w:t>
             </w:r>
           </w:p>
         </w:tc>
@@ -5132,23 +4694,19 @@
                 <w:color w:val="64748B"/>
                 <w:sz w:val="16"/>
               </w:rPr>
-              <w:t xml:space="preserve">Pre-assigned Equine Veterinarian, Dentist &amp; Farrier directory </w:t>
+              <w:t>Pre-assigned Equine Veterinarian, Dentist &amp; Farrier directory with instant 1-tap calling</w:t>
             </w:r>
             <w:r>
               <w:rPr>
                 <w:color w:val="64748B"/>
                 <w:sz w:val="16"/>
               </w:rPr>
-              <w:t>with instant 1-tap calling</w:t>
-            </w:r>
-            <w:r>
-              <w:rPr>
-                <w:color w:val="64748B"/>
-                <w:sz w:val="16"/>
-              </w:rPr>
               <w:br/>
             </w:r>
             <w:r>
+              <w:rPr>
+                <w:noProof/>
+              </w:rPr>
               <w:lastRenderedPageBreak/>
               <w:drawing>
                 <wp:inline distT="0" distB="0" distL="0" distR="0" wp14:anchorId="121A2953" wp14:editId="10B02148">
@@ -5299,14 +4857,7 @@
                 <w:color w:val="334155"/>
                 <w:sz w:val="17"/>
               </w:rPr>
-              <w:t xml:space="preserve">Removed premature due date displays from initial gestation </w:t>
-            </w:r>
-            <w:r>
-              <w:rPr>
-                <w:color w:val="334155"/>
-                <w:sz w:val="17"/>
-              </w:rPr>
-              <w:t>cards</w:t>
+              <w:t>Removed premature due date displays from initial gestation cards</w:t>
             </w:r>
           </w:p>
         </w:tc>
@@ -5360,15 +4911,7 @@
           <w:color w:val="334155"/>
           <w:sz w:val="19"/>
         </w:rPr>
-        <w:t xml:space="preserve">: Removed premature due-date widgets from gestation setup screens. The foaling due </w:t>
-      </w:r>
-      <w:r>
-        <w:rPr>
-          <w:rFonts w:ascii="Calibri" w:hAnsi="Calibri"/>
-          <w:color w:val="334155"/>
-          <w:sz w:val="19"/>
-        </w:rPr>
-        <w:t>date is presented exclusively at Step 6 of the Breeding Wizard, on the Live Synced Stud Foaling Diary, and within the dedicated Due Date Calculator screen.</w:t>
+        <w:t>: Removed premature due-date widgets from gestation setup screens. The foaling due date is presented exclusively at Step 6 of the Breeding Wizard, on the Live Synced Stud Foaling Diary, and within the dedicated Due Date Calculator screen.</w:t>
       </w:r>
     </w:p>
     <w:tbl>
@@ -5437,15 +4980,7 @@
                 <w:color w:val="334155"/>
                 <w:sz w:val="18"/>
               </w:rPr>
-              <w:t xml:space="preserve">The premature 'Mare Foaling Due' display has been </w:t>
-            </w:r>
-            <w:r>
-              <w:rPr>
-                <w:rFonts w:ascii="Calibri" w:hAnsi="Calibri"/>
-                <w:color w:val="334155"/>
-                <w:sz w:val="18"/>
-              </w:rPr>
-              <w:t>removed from early gestation inputs. Breeders now experience a clean data entry flow where the date is presented at its proper milestone.</w:t>
+              <w:t>The premature 'Mare Foaling Due' display has been removed from early gestation inputs. Breeders now experience a clean data entry flow where the date is presented at its proper milestone.</w:t>
             </w:r>
           </w:p>
         </w:tc>
@@ -5521,14 +5056,7 @@
                 <w:color w:val="64748B"/>
                 <w:sz w:val="16"/>
               </w:rPr>
-              <w:t xml:space="preserve">Instant standalone due date calculation showing </w:t>
-            </w:r>
-            <w:r>
-              <w:rPr>
-                <w:color w:val="64748B"/>
-                <w:sz w:val="16"/>
-              </w:rPr>
-              <w:t>280 days remaining and viable birth windows</w:t>
+              <w:t>Instant standalone due date calculation showing 280 days remaining and viable birth windows</w:t>
             </w:r>
             <w:r>
               <w:rPr>
@@ -5658,15 +5186,7 @@
                 <w:color w:val="1E3A8A"/>
                 <w:sz w:val="17"/>
               </w:rPr>
-              <w:t xml:space="preserve">STATUS: SUPPORTED IN SUPABASE DATABASE </w:t>
-            </w:r>
-            <w:r>
-              <w:rPr>
-                <w:b/>
-                <w:color w:val="1E3A8A"/>
-                <w:sz w:val="17"/>
-              </w:rPr>
-              <w:t>&amp; UI ROUTING ✅</w:t>
+              <w:t>STATUS: SUPPORTED IN SUPABASE DATABASE &amp; UI ROUTING ✅</w:t>
             </w:r>
           </w:p>
         </w:tc>
@@ -5730,15 +5250,7 @@
           <w:color w:val="334155"/>
           <w:sz w:val="19"/>
         </w:rPr>
-        <w:t xml:space="preserve">: Tracey highlighted the critical commercial scenario: One donor mare may have two or </w:t>
-      </w:r>
-      <w:r>
-        <w:rPr>
-          <w:rFonts w:ascii="Calibri" w:hAnsi="Calibri"/>
-          <w:color w:val="334155"/>
-          <w:sz w:val="19"/>
-        </w:rPr>
-        <w:t>more embryos flushed in a single breeding season, which are transferred into separate Recipient surrogate mares. Each Recipient mare is a physically different horse, and each will give birth to a separate foal.</w:t>
+        <w:t>: Tracey highlighted the critical commercial scenario: One donor mare may have two or more embryos flushed in a single breeding season, which are transferred into separate Recipient surrogate mares. Each Recipient mare is a physically different horse, and each will give birth to a separate foal.</w:t>
       </w:r>
     </w:p>
     <w:p>
@@ -5761,15 +5273,7 @@
           <w:color w:val="334155"/>
           <w:sz w:val="19"/>
         </w:rPr>
-        <w:t>: Our database schema</w:t>
-      </w:r>
-      <w:r>
-        <w:rPr>
-          <w:rFonts w:ascii="Calibri" w:hAnsi="Calibri"/>
-          <w:color w:val="334155"/>
-          <w:sz w:val="19"/>
-        </w:rPr>
-        <w:t xml:space="preserve"> solves this via the polymorphic markings table:</w:t>
+        <w:t>: Our database schema solves this via the polymorphic markings table:</w:t>
       </w:r>
       <w:r>
         <w:rPr>
@@ -5796,15 +5300,7 @@
           <w:sz w:val="19"/>
         </w:rPr>
         <w:br/>
-        <w:t>• Recipient Mare 1 is a separate</w:t>
-      </w:r>
-      <w:r>
-        <w:rPr>
-          <w:rFonts w:ascii="Calibri" w:hAnsi="Calibri"/>
-          <w:color w:val="334155"/>
-          <w:sz w:val="19"/>
-        </w:rPr>
-        <w:t xml:space="preserve"> row in animals table ➔ gets her own distinct markings record.</w:t>
+        <w:t>• Recipient Mare 1 is a separate row in animals table ➔ gets her own distinct markings record.</w:t>
       </w:r>
       <w:r>
         <w:rPr>
@@ -5831,15 +5327,7 @@
           <w:sz w:val="19"/>
         </w:rPr>
         <w:br/>
-        <w:t>• Foal 2</w:t>
-      </w:r>
-      <w:r>
-        <w:rPr>
-          <w:rFonts w:ascii="Calibri" w:hAnsi="Calibri"/>
-          <w:color w:val="334155"/>
-          <w:sz w:val="19"/>
-        </w:rPr>
-        <w:t xml:space="preserve"> (resulting from Recip 2) is a row in foals table ➔ gets its own markings record.</w:t>
+        <w:t>• Foal 2 (resulting from Recip 2) is a row in foals table ➔ gets its own markings record.</w:t>
       </w:r>
     </w:p>
     <w:p>
@@ -5862,15 +5350,7 @@
           <w:color w:val="334155"/>
           <w:sz w:val="19"/>
         </w:rPr>
-        <w:t>: When managing physical markings for any animal (Mare, Recip, or Foal), the app opens the 3-angle photo capture suite (Left, Right, Face/Head) wit</w:t>
-      </w:r>
-      <w:r>
-        <w:rPr>
-          <w:rFonts w:ascii="Calibri" w:hAnsi="Calibri"/>
-          <w:color w:val="334155"/>
-          <w:sz w:val="19"/>
-        </w:rPr>
-        <w:t>h device camera priority.</w:t>
+        <w:t>: When managing physical markings for any animal (Mare, Recip, or Foal), the app opens the 3-angle photo capture suite (Left, Right, Face/Head) with device camera priority.</w:t>
       </w:r>
     </w:p>
     <w:tbl>
@@ -5928,15 +5408,7 @@
                 <w:color w:val="334155"/>
                 <w:sz w:val="18"/>
               </w:rPr>
-              <w:t xml:space="preserve">CONFIRMATION: The ABP architecture completely supports the 1-Mare ➔ Multiple-Recips ➔ Multiple-Foals workflow. Because both Donor Mares and Recipient Mares exist as unique animal </w:t>
-            </w:r>
-            <w:r>
-              <w:rPr>
-                <w:rFonts w:ascii="Calibri" w:hAnsi="Calibri"/>
-                <w:color w:val="334155"/>
-                <w:sz w:val="18"/>
-              </w:rPr>
-              <w:t>entities in the registry, each Recipient has her own independent physical markings, microchip, and brand record. Each resulting foal likewise possesses an isolated birth record and markings profile linked to its genetic dam and surrogate recipient.</w:t>
+              <w:t>CONFIRMATION: The ABP architecture completely supports the 1-Mare ➔ Multiple-Recips ➔ Multiple-Foals workflow. Because both Donor Mares and Recipient Mares exist as unique animal entities in the registry, each Recipient has her own independent physical markings, microchip, and brand record. Each resulting foal likewise possesses an isolated birth record and markings profile linked to its genetic dam and surrogate recipient.</w:t>
             </w:r>
           </w:p>
         </w:tc>
@@ -6037,6 +5509,9 @@
               <w:br/>
             </w:r>
             <w:r>
+              <w:rPr>
+                <w:noProof/>
+              </w:rPr>
               <w:lastRenderedPageBreak/>
               <w:drawing>
                 <wp:inline distT="0" distB="0" distL="0" distR="0" wp14:anchorId="1B24D472" wp14:editId="0E66C9C3">
@@ -6076,6 +5551,7 @@
             </w:r>
             <w:r>
               <w:rPr>
+                <w:noProof/>
                 <w:color w:val="64748B"/>
                 <w:sz w:val="16"/>
               </w:rPr>
@@ -6618,7 +6094,7 @@
                 <w:color w:val="0A192F"/>
                 <w:sz w:val="18"/>
               </w:rPr>
-              <w:t xml:space="preserve">Official Equine </w:t>
+              <w:t>Official Equine Foal Certificate PDF</w:t>
             </w:r>
             <w:r>
               <w:rPr>
@@ -6626,14 +6102,6 @@
                 <w:color w:val="0A192F"/>
                 <w:sz w:val="18"/>
               </w:rPr>
-              <w:t>Foal Certificate PDF</w:t>
-            </w:r>
-            <w:r>
-              <w:rPr>
-                <w:b/>
-                <w:color w:val="0A192F"/>
-                <w:sz w:val="18"/>
-              </w:rPr>
               <w:br/>
             </w:r>
             <w:r>
@@ -6651,6 +6119,9 @@
               <w:br/>
             </w:r>
             <w:r>
+              <w:rPr>
+                <w:noProof/>
+              </w:rPr>
               <w:lastRenderedPageBreak/>
               <w:drawing>
                 <wp:inline distT="0" distB="0" distL="0" distR="0" wp14:anchorId="7DB1E51D" wp14:editId="2CAF86E4">
@@ -6690,6 +6161,7 @@
             </w:r>
             <w:r>
               <w:rPr>
+                <w:noProof/>
                 <w:color w:val="64748B"/>
                 <w:sz w:val="16"/>
               </w:rPr>
@@ -6730,8 +6202,6 @@
                 </wp:inline>
               </w:drawing>
             </w:r>
-            <w:bookmarkStart w:id="0" w:name="_GoBack"/>
-            <w:bookmarkEnd w:id="0"/>
           </w:p>
         </w:tc>
       </w:tr>
@@ -6813,15 +6283,7 @@
                 <w:color w:val="1E3A8A"/>
                 <w:sz w:val="17"/>
               </w:rPr>
-              <w:t>STAT</w:t>
-            </w:r>
-            <w:r>
-              <w:rPr>
-                <w:b/>
-                <w:color w:val="1E3A8A"/>
-                <w:sz w:val="17"/>
-              </w:rPr>
-              <w:t>US: ENHANCED WITH OFFICIAL CREST &amp; STREAMLINED ACTIONS ✅</w:t>
+              <w:t>STATUS: ENHANCED WITH OFFICIAL CREST &amp; STREAMLINED ACTIONS ✅</w:t>
             </w:r>
           </w:p>
         </w:tc>
@@ -6884,15 +6346,7 @@
           <w:color w:val="334155"/>
           <w:sz w:val="19"/>
         </w:rPr>
-        <w:t xml:space="preserve">: Replaced the generic star icon with the official AbpOfficialLogo brand crest, encased in a glowing golden </w:t>
-      </w:r>
-      <w:r>
-        <w:rPr>
-          <w:rFonts w:ascii="Calibri" w:hAnsi="Calibri"/>
-          <w:color w:val="334155"/>
-          <w:sz w:val="19"/>
-        </w:rPr>
-        <w:t>radial ring with luxury particle celebration.</w:t>
+        <w:t>: Replaced the generic star icon with the official AbpOfficialLogo brand crest, encased in a glowing golden radial ring with luxury particle celebration.</w:t>
       </w:r>
     </w:p>
     <w:p>
@@ -6933,15 +6387,7 @@
           <w:sz w:val="19"/>
         </w:rPr>
         <w:br/>
-        <w:t>2. 'Open Stud Foaling Diary' ➔ Updates pasture location to Nursery Pad</w:t>
-      </w:r>
-      <w:r>
-        <w:rPr>
-          <w:rFonts w:ascii="Calibri" w:hAnsi="Calibri"/>
-          <w:color w:val="334155"/>
-          <w:sz w:val="19"/>
-        </w:rPr>
-        <w:t>dock</w:t>
+        <w:t>2. 'Open Stud Foaling Diary' ➔ Updates pasture location to Nursery Paddock</w:t>
       </w:r>
       <w:r>
         <w:rPr>
@@ -7008,15 +6454,7 @@
                 <w:color w:val="334155"/>
                 <w:sz w:val="18"/>
               </w:rPr>
-              <w:t>The Congratulations screen now proudly features the official ABP brand crest, luxury gold styling, and clear post-foaling clin</w:t>
-            </w:r>
-            <w:r>
-              <w:rPr>
-                <w:rFonts w:ascii="Calibri" w:hAnsi="Calibri"/>
-                <w:color w:val="334155"/>
-                <w:sz w:val="18"/>
-              </w:rPr>
-              <w:t xml:space="preserve">ical </w:t>
+              <w:t xml:space="preserve">The Congratulations screen now proudly features the official ABP brand crest, luxury gold styling, and clear post-foaling clinical </w:t>
             </w:r>
             <w:r>
               <w:rPr>
@@ -7295,16 +6733,7 @@
           <w:color w:val="0A192F"/>
           <w:sz w:val="19"/>
         </w:rPr>
-        <w:t xml:space="preserve">Tracey's Explicit </w:t>
-      </w:r>
-      <w:r>
-        <w:rPr>
-          <w:rFonts w:ascii="Calibri" w:hAnsi="Calibri"/>
-          <w:b/>
-          <w:color w:val="0A192F"/>
-          <w:sz w:val="19"/>
-        </w:rPr>
-        <w:t>Requirements</w:t>
+        <w:t>Tracey's Explicit Requirements</w:t>
       </w:r>
       <w:r>
         <w:rPr>
@@ -7353,15 +6782,7 @@
           <w:color w:val="334155"/>
           <w:sz w:val="19"/>
         </w:rPr>
-        <w:t xml:space="preserve">: To provide maximum clarity and veterinary excellence, </w:t>
-      </w:r>
-      <w:r>
-        <w:rPr>
-          <w:rFonts w:ascii="Calibri" w:hAnsi="Calibri"/>
-          <w:color w:val="334155"/>
-          <w:sz w:val="19"/>
-        </w:rPr>
-        <w:t>the protocol is structured as:</w:t>
+        <w:t>: To provide maximum clarity and veterinary excellence, the protocol is structured as:</w:t>
       </w:r>
       <w:r>
         <w:rPr>
@@ -7370,23 +6791,7 @@
           <w:sz w:val="19"/>
         </w:rPr>
         <w:br/>
-        <w:t>• ⏱</w:t>
-      </w:r>
-      <w:r>
-        <w:rPr>
-          <w:rFonts w:ascii="Calibri" w:hAnsi="Calibri"/>
-          <w:color w:val="334155"/>
-          <w:sz w:val="19"/>
-        </w:rPr>
-        <w:t>️</w:t>
-      </w:r>
-      <w:r>
-        <w:rPr>
-          <w:rFonts w:ascii="Calibri" w:hAnsi="Calibri"/>
-          <w:color w:val="334155"/>
-          <w:sz w:val="19"/>
-        </w:rPr>
-        <w:t xml:space="preserve"> HOUR 1 (FOAL STANDING): Healthy foal should stand independently on all four legs within 60 minutes.</w:t>
+        <w:t>• ⏱️ HOUR 1 (FOAL STANDING): Healthy foal should stand independently on all four legs within 60 minutes.</w:t>
       </w:r>
       <w:r>
         <w:rPr>
@@ -7395,31 +6800,7 @@
           <w:sz w:val="19"/>
         </w:rPr>
         <w:br/>
-        <w:t xml:space="preserve">• </w:t>
-      </w:r>
-      <w:r>
-        <w:rPr>
-          <w:rFonts w:ascii="Calibri" w:hAnsi="Calibri"/>
-          <w:color w:val="334155"/>
-          <w:sz w:val="19"/>
-        </w:rPr>
-        <w:t>🍼</w:t>
-      </w:r>
-      <w:r>
-        <w:rPr>
-          <w:rFonts w:ascii="Calibri" w:hAnsi="Calibri"/>
-          <w:color w:val="334155"/>
-          <w:sz w:val="19"/>
-        </w:rPr>
-        <w:t xml:space="preserve"> HOUR 2 (FOAL NURSING): Foal must actively nurse colostrum within 2 hours to ensure critical passive transfer of mat</w:t>
-      </w:r>
-      <w:r>
-        <w:rPr>
-          <w:rFonts w:ascii="Calibri" w:hAnsi="Calibri"/>
-          <w:color w:val="334155"/>
-          <w:sz w:val="19"/>
-        </w:rPr>
-        <w:t>ernal antibodies (IgG).</w:t>
+        <w:t>• 🍼 HOUR 2 (FOAL NURSING): Foal must actively nurse colostrum within 2 hours to ensure critical passive transfer of maternal antibodies (IgG).</w:t>
       </w:r>
       <w:r>
         <w:rPr>
@@ -7428,23 +6809,7 @@
           <w:sz w:val="19"/>
         </w:rPr>
         <w:br/>
-        <w:t xml:space="preserve">• </w:t>
-      </w:r>
-      <w:r>
-        <w:rPr>
-          <w:rFonts w:ascii="Calibri" w:hAnsi="Calibri"/>
-          <w:color w:val="334155"/>
-          <w:sz w:val="19"/>
-        </w:rPr>
-        <w:t>🩺</w:t>
-      </w:r>
-      <w:r>
-        <w:rPr>
-          <w:rFonts w:ascii="Calibri" w:hAnsi="Calibri"/>
-          <w:color w:val="334155"/>
-          <w:sz w:val="19"/>
-        </w:rPr>
-        <w:t xml:space="preserve"> HOUR 3 (MARE PLACENTA): Mare must pass the complete, intact placenta within 3 hours. (WARNING: A retained placenta beyond 3 hours is an acute veterinary emergency that can lead to toxic metritis, laminitis, and fatal sepsis).</w:t>
+        <w:t>• 🩺 HOUR 3 (MARE PLACENTA): Mare must pass the complete, intact placenta within 3 hours. (WARNING: A retained placenta beyond 3 hours is an acute veterinary emergency that can lead to toxic metritis, laminitis, and fatal sepsis).</w:t>
       </w:r>
       <w:r>
         <w:rPr>
@@ -7453,31 +6818,7 @@
           <w:sz w:val="19"/>
         </w:rPr>
         <w:br/>
-        <w:t>•</w:t>
-      </w:r>
-      <w:r>
-        <w:rPr>
-          <w:rFonts w:ascii="Calibri" w:hAnsi="Calibri"/>
-          <w:color w:val="334155"/>
-          <w:sz w:val="19"/>
-        </w:rPr>
-        <w:t xml:space="preserve"> </w:t>
-      </w:r>
-      <w:r>
-        <w:rPr>
-          <w:rFonts w:ascii="Calibri" w:hAnsi="Calibri"/>
-          <w:color w:val="334155"/>
-          <w:sz w:val="19"/>
-        </w:rPr>
-        <w:t>💩</w:t>
-      </w:r>
-      <w:r>
-        <w:rPr>
-          <w:rFonts w:ascii="Calibri" w:hAnsi="Calibri"/>
-          <w:color w:val="334155"/>
-          <w:sz w:val="19"/>
-        </w:rPr>
-        <w:t xml:space="preserve"> POST-DELIVERY VITAL (MECONIUM): Foal must pass dark, tarry meconium (first stool) within 2–4 hours to prevent meconium impaction colic.</w:t>
+        <w:t>• 💩 POST-DELIVERY VITAL (MECONIUM): Foal must pass dark, tarry meconium (first stool) within 2–4 hours to prevent meconium impaction colic.</w:t>
       </w:r>
     </w:p>
     <w:p>
@@ -7500,15 +6841,7 @@
           <w:color w:val="334155"/>
           <w:sz w:val="19"/>
         </w:rPr>
-        <w:t xml:space="preserve">: Rendered as an emergency-highlighted clinical card directly on the Congratulations screen and in </w:t>
-      </w:r>
-      <w:r>
-        <w:rPr>
-          <w:rFonts w:ascii="Calibri" w:hAnsi="Calibri"/>
-          <w:color w:val="334155"/>
-          <w:sz w:val="19"/>
-        </w:rPr>
-        <w:t>the Foal Registration notes.</w:t>
+        <w:t>: Rendered as an emergency-highlighted clinical card directly on the Congratulations screen and in the Foal Registration notes.</w:t>
       </w:r>
     </w:p>
     <w:tbl>
@@ -7566,15 +6899,7 @@
                 <w:color w:val="334155"/>
                 <w:sz w:val="18"/>
               </w:rPr>
-              <w:t>CONFIRMATION: The 1-2-3 Post-Foaling Rule has been written with complete veterinary accuracy. It emphasizes the vital 3-hour placenta delivery rule (with retained placenta warn</w:t>
-            </w:r>
-            <w:r>
-              <w:rPr>
-                <w:rFonts w:ascii="Calibri" w:hAnsi="Calibri"/>
-                <w:color w:val="334155"/>
-                <w:sz w:val="18"/>
-              </w:rPr>
-              <w:t>ing) and the foal meconium passage milestone, empowering breeders to recognize critical emergencies early.</w:t>
+              <w:t>CONFIRMATION: The 1-2-3 Post-Foaling Rule has been written with complete veterinary accuracy. It emphasizes the vital 3-hour placenta delivery rule (with retained placenta warning) and the foal meconium passage milestone, empowering breeders to recognize critical emergencies early.</w:t>
             </w:r>
           </w:p>
         </w:tc>
@@ -7659,6 +6984,9 @@
               <w:br/>
             </w:r>
             <w:r>
+              <w:rPr>
+                <w:noProof/>
+              </w:rPr>
               <w:lastRenderedPageBreak/>
               <w:drawing>
                 <wp:inline distT="0" distB="0" distL="0" distR="0" wp14:anchorId="3F248ADC" wp14:editId="4CD46116">
@@ -7698,6 +7026,7 @@
             </w:r>
             <w:r>
               <w:rPr>
+                <w:noProof/>
                 <w:color w:val="64748B"/>
                 <w:sz w:val="16"/>
               </w:rPr>
@@ -7759,16 +7088,7 @@
           <w:color w:val="1E3A8A"/>
           <w:sz w:val="23"/>
         </w:rPr>
-        <w:t xml:space="preserve">Item 14: Scan &amp; </w:t>
-      </w:r>
-      <w:r>
-        <w:rPr>
-          <w:rFonts w:ascii="Calibri" w:hAnsi="Calibri"/>
-          <w:b/>
-          <w:color w:val="1E3A8A"/>
-          <w:sz w:val="23"/>
-        </w:rPr>
-        <w:t>Vaccination Calendar Alerts (Device &amp; Cloud Synchronization)</w:t>
+        <w:t>Item 14: Scan &amp; Vaccination Calendar Alerts (Device &amp; Cloud Synchronization)</w:t>
       </w:r>
     </w:p>
     <w:tbl>
@@ -7860,14 +7180,7 @@
                 <w:color w:val="334155"/>
                 <w:sz w:val="17"/>
               </w:rPr>
-              <w:t>Ultrasound Scans (Day 14, 28, 45), Vaccine</w:t>
-            </w:r>
-            <w:r>
-              <w:rPr>
-                <w:color w:val="334155"/>
-                <w:sz w:val="17"/>
-              </w:rPr>
-              <w:t xml:space="preserve"> Boosters, and Foaling Due Date Alerts</w:t>
+              <w:t>Ultrasound Scans (Day 14, 28, 45), Vaccine Boosters, and Foaling Due Date Alerts</w:t>
             </w:r>
           </w:p>
         </w:tc>
@@ -7907,15 +7220,7 @@
           <w:sz w:val="19"/>
         </w:rPr>
         <w:br/>
-        <w:t xml:space="preserve">• Automatically computes Scan 1 (Day 14-16), Scan 2 (Day 28-30), Scan 3 (Day </w:t>
-      </w:r>
-      <w:r>
-        <w:rPr>
-          <w:rFonts w:ascii="Calibri" w:hAnsi="Calibri"/>
-          <w:color w:val="334155"/>
-          <w:sz w:val="19"/>
-        </w:rPr>
-        <w:t>45), Close Paddock (30 days prior), Foaling Barn (10 days prior), and Foaling Due Date (Day 340).</w:t>
+        <w:t>• Automatically computes Scan 1 (Day 14-16), Scan 2 (Day 28-30), Scan 3 (Day 45), Close Paddock (30 days prior), Foaling Barn (10 days prior), and Foaling Due Date (Day 340).</w:t>
       </w:r>
       <w:r>
         <w:rPr>
@@ -7939,16 +7244,7 @@
           <w:color w:val="0A192F"/>
           <w:sz w:val="19"/>
         </w:rPr>
-        <w:t>What is Required for Native Devic</w:t>
-      </w:r>
-      <w:r>
-        <w:rPr>
-          <w:rFonts w:ascii="Calibri" w:hAnsi="Calibri"/>
-          <w:b/>
-          <w:color w:val="0A192F"/>
-          <w:sz w:val="19"/>
-        </w:rPr>
-        <w:t>e Calendar Sync (iOS/Android)</w:t>
+        <w:t>What is Required for Native Device Calendar Sync (iOS/Android)</w:t>
       </w:r>
       <w:r>
         <w:rPr>
@@ -7983,15 +7279,7 @@
           <w:sz w:val="19"/>
         </w:rPr>
         <w:br/>
-        <w:t>2.</w:t>
-      </w:r>
-      <w:r>
-        <w:rPr>
-          <w:rFonts w:ascii="Calibri" w:hAnsi="Calibri"/>
-          <w:color w:val="334155"/>
-          <w:sz w:val="19"/>
-        </w:rPr>
-        <w:t xml:space="preserve"> One-Tap 'Sync All Dates to Phone Calendar' action on the Breeding Wizard finish screen and Preventative Care screen.</w:t>
+        <w:t>2. One-Tap 'Sync All Dates to Phone Calendar' action on the Breeding Wizard finish screen and Preventative Care screen.</w:t>
       </w:r>
       <w:r>
         <w:rPr>
@@ -8000,15 +7288,7 @@
           <w:sz w:val="19"/>
         </w:rPr>
         <w:br/>
-        <w:t xml:space="preserve">3. Push Notifications Engine via flutter_local_notifications / Firebase Cloud Messaging (FCM) to trigger alarms 24 hours before each scan </w:t>
-      </w:r>
-      <w:r>
-        <w:rPr>
-          <w:rFonts w:ascii="Calibri" w:hAnsi="Calibri"/>
-          <w:color w:val="334155"/>
-          <w:sz w:val="19"/>
-        </w:rPr>
-        <w:t>and vaccine date.</w:t>
+        <w:t>3. Push Notifications Engine via flutter_local_notifications / Firebase Cloud Messaging (FCM) to trigger alarms 24 hours before each scan and vaccine date.</w:t>
       </w:r>
     </w:p>
     <w:p>
@@ -8072,7 +7352,7 @@
                 <w:color w:val="059669"/>
                 <w:sz w:val="19"/>
               </w:rPr>
-              <w:t>DIRECT ANSWER &amp; TECHNICAL RECOMMENDATION (ITEM 1</w:t>
+              <w:t>DIRECT ANSWER &amp; TECHNICAL RECOMMENDATION (ITEM 14)</w:t>
             </w:r>
             <w:r>
               <w:rPr>
@@ -8081,15 +7361,6 @@
                 <w:color w:val="059669"/>
                 <w:sz w:val="19"/>
               </w:rPr>
-              <w:t>4)</w:t>
-            </w:r>
-            <w:r>
-              <w:rPr>
-                <w:rFonts w:ascii="Calibri" w:hAnsi="Calibri"/>
-                <w:b/>
-                <w:color w:val="059669"/>
-                <w:sz w:val="19"/>
-              </w:rPr>
               <w:br/>
             </w:r>
             <w:r>
@@ -8116,15 +7387,7 @@
                 <w:sz w:val="18"/>
               </w:rPr>
               <w:br/>
-              <w:t>• For direct synchronization with iOS Apple Calendar and Android Google Calendar, we hav</w:t>
-            </w:r>
-            <w:r>
-              <w:rPr>
-                <w:rFonts w:ascii="Calibri" w:hAnsi="Calibri"/>
-                <w:color w:val="334155"/>
-                <w:sz w:val="18"/>
-              </w:rPr>
-              <w:t>e specified the `device_calendar` native bridge and `.ics` calendar feed export, ready for immediate deployment.</w:t>
+              <w:t>• For direct synchronization with iOS Apple Calendar and Android Google Calendar, we have specified the `device_calendar` native bridge and `.ics` calendar feed export, ready for immediate deployment.</w:t>
             </w:r>
           </w:p>
         </w:tc>
@@ -8199,23 +7462,19 @@
                 <w:color w:val="64748B"/>
                 <w:sz w:val="16"/>
               </w:rPr>
-              <w:t xml:space="preserve">Real-time chronological feed: Scan 1 Overdue, Scan 2 in 1 Day, and Upcoming </w:t>
+              <w:t>Real-time chronological feed: Scan 1 Overdue, Scan 2 in 1 Day, and Upcoming Scan checks</w:t>
             </w:r>
             <w:r>
               <w:rPr>
                 <w:color w:val="64748B"/>
                 <w:sz w:val="16"/>
               </w:rPr>
-              <w:t>Scan checks</w:t>
-            </w:r>
-            <w:r>
-              <w:rPr>
-                <w:color w:val="64748B"/>
-                <w:sz w:val="16"/>
-              </w:rPr>
               <w:br/>
             </w:r>
             <w:r>
+              <w:rPr>
+                <w:noProof/>
+              </w:rPr>
               <w:drawing>
                 <wp:inline distT="0" distB="0" distL="0" distR="0" wp14:anchorId="4087C04D" wp14:editId="365A455D">
                   <wp:extent cx="3762900" cy="5268060"/>
@@ -8366,14 +7625,7 @@
                 <w:color w:val="334155"/>
                 <w:sz w:val="17"/>
               </w:rPr>
-              <w:t xml:space="preserve">Automated High-Priority </w:t>
-            </w:r>
-            <w:r>
-              <w:rPr>
-                <w:color w:val="334155"/>
-                <w:sz w:val="17"/>
-              </w:rPr>
-              <w:t>Reminder to Open Caslick's Vulvoplasty Prior to Foaling</w:t>
+              <w:t>Automated High-Priority Reminder to Open Caslick's Vulvoplasty Prior to Foaling</w:t>
             </w:r>
           </w:p>
         </w:tc>
@@ -8419,16 +7671,7 @@
           <w:color w:val="0A192F"/>
           <w:sz w:val="19"/>
         </w:rPr>
-        <w:t xml:space="preserve">Veterinary </w:t>
-      </w:r>
-      <w:r>
-        <w:rPr>
-          <w:rFonts w:ascii="Calibri" w:hAnsi="Calibri"/>
-          <w:b/>
-          <w:color w:val="0A192F"/>
-          <w:sz w:val="19"/>
-        </w:rPr>
-        <w:t>Rationale</w:t>
+        <w:t>Veterinary Rationale</w:t>
       </w:r>
       <w:r>
         <w:rPr>
@@ -8436,15 +7679,7 @@
           <w:color w:val="334155"/>
           <w:sz w:val="19"/>
         </w:rPr>
-        <w:t>: A Caslick's procedure (surgical stitching of the upper vulval lips) is performed on mares with poor perineal conformation to prevent fecal contamination and uterine infection. If the Caslick is NOT opened (vulvotomy / Caslick breakdown) 2 to 4 w</w:t>
-      </w:r>
-      <w:r>
-        <w:rPr>
-          <w:rFonts w:ascii="Calibri" w:hAnsi="Calibri"/>
-          <w:color w:val="334155"/>
-          <w:sz w:val="19"/>
-        </w:rPr>
-        <w:t>eeks before foaling, the foal will tear through the closed vulva, causing third-degree perineal tears, rectovaginal fistula, and irreversible reproductive damage.</w:t>
+        <w:t>: A Caslick's procedure (surgical stitching of the upper vulval lips) is performed on mares with poor perineal conformation to prevent fecal contamination and uterine infection. If the Caslick is NOT opened (vulvotomy / Caslick breakdown) 2 to 4 weeks before foaling, the foal will tear through the closed vulva, causing third-degree perineal tears, rectovaginal fistula, and irreversible reproductive damage.</w:t>
       </w:r>
     </w:p>
     <w:p>
@@ -8467,15 +7702,7 @@
           <w:color w:val="334155"/>
           <w:sz w:val="19"/>
         </w:rPr>
-        <w:t>: • Trigger Date: foaling_due_date - 30 days (approximately Day</w:t>
-      </w:r>
-      <w:r>
-        <w:rPr>
-          <w:rFonts w:ascii="Calibri" w:hAnsi="Calibri"/>
-          <w:color w:val="334155"/>
-          <w:sz w:val="19"/>
-        </w:rPr>
-        <w:t xml:space="preserve"> 310 of gestation).</w:t>
+        <w:t>: • Trigger Date: foaling_due_date - 30 days (approximately Day 310 of gestation).</w:t>
       </w:r>
       <w:r>
         <w:rPr>
@@ -8484,31 +7711,7 @@
           <w:sz w:val="19"/>
         </w:rPr>
         <w:br/>
-        <w:t>• Location: Appears as a prominent Crimson/Gold high-priority banner in the Stud Foaling Diary, the Gestation Timeline, and triggers a high-priority push notification: '</w:t>
-      </w:r>
-      <w:r>
-        <w:rPr>
-          <w:rFonts w:ascii="Calibri" w:hAnsi="Calibri"/>
-          <w:color w:val="334155"/>
-          <w:sz w:val="19"/>
-        </w:rPr>
-        <w:t>🚨</w:t>
-      </w:r>
-      <w:r>
-        <w:rPr>
-          <w:rFonts w:ascii="Calibri" w:hAnsi="Calibri"/>
-          <w:color w:val="334155"/>
-          <w:sz w:val="19"/>
-        </w:rPr>
-        <w:t xml:space="preserve"> CRITICAL CASLICK ALERT: [Mare Name] is 30 days from foaling. Sch</w:t>
-      </w:r>
-      <w:r>
-        <w:rPr>
-          <w:rFonts w:ascii="Calibri" w:hAnsi="Calibri"/>
-          <w:color w:val="334155"/>
-          <w:sz w:val="19"/>
-        </w:rPr>
-        <w:t>edule veterinarian to open Caslick's vulvoplasty immediately.'</w:t>
+        <w:t>• Location: Appears as a prominent Crimson/Gold high-priority banner in the Stud Foaling Diary, the Gestation Timeline, and triggers a high-priority push notification: '🚨 CRITICAL CASLICK ALERT: [Mare Name] is 30 days from foaling. Schedule veterinarian to open Caslick's vulvoplasty immediately.'</w:t>
       </w:r>
       <w:r>
         <w:rPr>
@@ -8575,23 +7778,7 @@
                 <w:color w:val="334155"/>
                 <w:sz w:val="18"/>
               </w:rPr>
-              <w:t xml:space="preserve">CONFIRMATION: The Caslick Alert is fully integrated </w:t>
-            </w:r>
-            <w:r>
-              <w:rPr>
-                <w:rFonts w:ascii="Calibri" w:hAnsi="Calibri"/>
-                <w:color w:val="334155"/>
-                <w:sz w:val="18"/>
-              </w:rPr>
-              <w:t xml:space="preserve">into the pregnancy calculation engine. Whenever an equine pregnancy is activated (or advanced info indicates a Caslick is present), the system automatically schedules a high-priority alert 30 days before the projected foaling date, guaranteeing the mare's </w:t>
-            </w:r>
-            <w:r>
-              <w:rPr>
-                <w:rFonts w:ascii="Calibri" w:hAnsi="Calibri"/>
-                <w:color w:val="334155"/>
-                <w:sz w:val="18"/>
-              </w:rPr>
-              <w:t>safety.</w:t>
+              <w:t>CONFIRMATION: The Caslick Alert is fully integrated into the pregnancy calculation engine. Whenever an equine pregnancy is activated (or advanced info indicates a Caslick is present), the system automatically schedules a high-priority alert 30 days before the projected foaling date, guaranteeing the mare's safety.</w:t>
             </w:r>
           </w:p>
         </w:tc>
@@ -8781,15 +7968,7 @@
                 <w:color w:val="0A192F"/>
                 <w:sz w:val="17"/>
               </w:rPr>
-              <w:t xml:space="preserve">CLASSIFICATION: [PROJECT &amp; CLIENT CLARIFICATION — </w:t>
-            </w:r>
-            <w:r>
-              <w:rPr>
-                <w:b/>
-                <w:color w:val="0A192F"/>
-                <w:sz w:val="17"/>
-              </w:rPr>
-              <w:t>TRANSPARENT EXPLANATION]</w:t>
+              <w:t>CLASSIFICATION: [PROJECT &amp; CLIENT CLARIFICATION — TRANSPARENT EXPLANATION]</w:t>
             </w:r>
             <w:r>
               <w:rPr>
@@ -8868,15 +8047,7 @@
           <w:color w:val="334155"/>
           <w:sz w:val="19"/>
         </w:rPr>
-        <w:t>: In previous progress reports and consolidated documentation</w:t>
-      </w:r>
-      <w:r>
-        <w:rPr>
-          <w:rFonts w:ascii="Calibri" w:hAnsi="Calibri"/>
-          <w:color w:val="334155"/>
-          <w:sz w:val="19"/>
-        </w:rPr>
-        <w:t xml:space="preserve"> generated by Rehman (lead developer), two items were explicitly flagged under the heading 'Pending Items Awaiting Client External Inputs' to maintain total development transparency.</w:t>
+        <w:t>: In previous progress reports and consolidated documentation generated by Rehman (lead developer), two items were explicitly flagged under the heading 'Pending Items Awaiting Client External Inputs' to maintain total development transparency.</w:t>
       </w:r>
     </w:p>
     <w:p>
@@ -8909,15 +8080,7 @@
           <w:sz w:val="19"/>
         </w:rPr>
         <w:br/>
-        <w:t>1.</w:t>
-      </w:r>
-      <w:r>
-        <w:rPr>
-          <w:rFonts w:ascii="Calibri" w:hAnsi="Calibri"/>
-          <w:color w:val="334155"/>
-          <w:sz w:val="19"/>
-        </w:rPr>
-        <w:t xml:space="preserve"> Formal Legal Terms of Service &amp; Privacy Policy: The technical layout and router endpoint (/disclaimer) were built 100% in Flutter, but the formal legal wording was pending delivery from Tracey's solicitor/lawyer.</w:t>
+        <w:t>1. Formal Legal Terms of Service &amp; Privacy Policy: The technical layout and router endpoint (/disclaimer) were built 100% in Flutter, but the formal legal wording was pending delivery from Tracey's solicitor/lawyer.</w:t>
       </w:r>
       <w:r>
         <w:rPr>
@@ -8926,15 +8089,7 @@
           <w:sz w:val="19"/>
         </w:rPr>
         <w:br/>
-        <w:t>2. Future Dog / Canine Module Content: The</w:t>
-      </w:r>
-      <w:r>
-        <w:rPr>
-          <w:rFonts w:ascii="Calibri" w:hAnsi="Calibri"/>
-          <w:color w:val="334155"/>
-          <w:sz w:val="19"/>
-        </w:rPr>
-        <w:t xml:space="preserve"> multi-species database architecture and species landing hub were prepared, but specific canine breed libraries and whelping protocols were pending Tracey's delivery.</w:t>
+        <w:t>2. Future Dog / Canine Module Content: The multi-species database architecture and species landing hub were prepared, but specific canine breed libraries and whelping protocols were pending Tracey's delivery.</w:t>
       </w:r>
     </w:p>
     <w:p>
@@ -8957,15 +8112,7 @@
           <w:color w:val="334155"/>
           <w:sz w:val="19"/>
         </w:rPr>
-        <w:t>: These were not unexpected or confusing features; they were simp</w:t>
-      </w:r>
-      <w:r>
-        <w:rPr>
-          <w:rFonts w:ascii="Calibri" w:hAnsi="Calibri"/>
-          <w:color w:val="334155"/>
-          <w:sz w:val="19"/>
-        </w:rPr>
-        <w:t>ly structured placeholders created to show Tracey that the technical framework is ready as soon as she provides the written content.</w:t>
+        <w:t>: These were not unexpected or confusing features; they were simply structured placeholders created to show Tracey that the technical framework is ready as soon as she provides the written content.</w:t>
       </w:r>
     </w:p>
     <w:tbl>
@@ -9023,23 +8170,7 @@
                 <w:color w:val="334155"/>
                 <w:sz w:val="18"/>
               </w:rPr>
-              <w:t>CLARIFICATION FOR TRACEY: The two items labelled under 'Rehman' were the</w:t>
-            </w:r>
-            <w:r>
-              <w:rPr>
-                <w:rFonts w:ascii="Calibri" w:hAnsi="Calibri"/>
-                <w:color w:val="334155"/>
-                <w:sz w:val="18"/>
-              </w:rPr>
-              <w:t xml:space="preserve"> 'Legal Terms / Solicitor Text' and the 'Dog Module Placeholder'. We built the underlying screens and database connections in advance so that as soon as Tracey provides her solicitor's legal text and canine notes, they can be plugged in instantly with zero</w:t>
-            </w:r>
-            <w:r>
-              <w:rPr>
-                <w:rFonts w:ascii="Calibri" w:hAnsi="Calibri"/>
-                <w:color w:val="334155"/>
-                <w:sz w:val="18"/>
-              </w:rPr>
-              <w:t xml:space="preserve"> code restructuring.</w:t>
+              <w:t>CLARIFICATION FOR TRACEY: The two items labelled under 'Rehman' were the 'Legal Terms / Solicitor Text' and the 'Dog Module Placeholder'. We built the underlying screens and database connections in advance so that as soon as Tracey provides her solicitor's legal text and canine notes, they can be plugged in instantly with zero code restructuring.</w:t>
             </w:r>
           </w:p>
         </w:tc>
@@ -9229,15 +8360,7 @@
                 <w:color w:val="0A192F"/>
                 <w:sz w:val="17"/>
               </w:rPr>
-              <w:t xml:space="preserve">CLASSIFICATION: [ROADMAP &amp; </w:t>
-            </w:r>
-            <w:r>
-              <w:rPr>
-                <w:b/>
-                <w:color w:val="0A192F"/>
-                <w:sz w:val="17"/>
-              </w:rPr>
-              <w:t>CONTRACTUAL SCOPE CLARIFICATION]</w:t>
+              <w:t>CLASSIFICATION: [ROADMAP &amp; CONTRACTUAL SCOPE CLARIFICATION]</w:t>
             </w:r>
             <w:r>
               <w:rPr>
@@ -9316,15 +8439,7 @@
           <w:color w:val="334155"/>
           <w:sz w:val="19"/>
         </w:rPr>
-        <w:t xml:space="preserve">: Milestones 1, 2, and 3 were contracted </w:t>
-      </w:r>
-      <w:r>
-        <w:rPr>
-          <w:rFonts w:ascii="Calibri" w:hAnsi="Calibri"/>
-          <w:color w:val="334155"/>
-          <w:sz w:val="19"/>
-        </w:rPr>
-        <w:t>specifically for the end-to-end Equine (Horse) platform (Onboarding, Breeding Wizard, Pregnancy Scans, Foaling Diary, Foal Registration, and Official Pedigree Certificate).</w:t>
+        <w:t>: Milestones 1, 2, and 3 were contracted specifically for the end-to-end Equine (Horse) platform (Onboarding, Breeding Wizard, Pregnancy Scans, Foaling Diary, Foal Registration, and Official Pedigree Certificate).</w:t>
       </w:r>
     </w:p>
     <w:p>
@@ -9348,15 +8463,7 @@
           <w:color w:val="334155"/>
           <w:sz w:val="19"/>
         </w:rPr>
-        <w:t>: We proactively designed the database with multi-spe</w:t>
-      </w:r>
-      <w:r>
-        <w:rPr>
-          <w:rFonts w:ascii="Calibri" w:hAnsi="Calibri"/>
-          <w:color w:val="334155"/>
-          <w:sz w:val="19"/>
-        </w:rPr>
-        <w:t>cies support (species = 'dog') and built the Species Selector Hub. Therefore, starting the Dog section does NOT require re-architecting the app.</w:t>
+        <w:t>: We proactively designed the database with multi-species support (species = 'dog') and built the Species Selector Hub. Therefore, starting the Dog section does NOT require re-architecting the app.</w:t>
       </w:r>
     </w:p>
     <w:p>
@@ -9388,15 +8495,7 @@
           <w:sz w:val="19"/>
         </w:rPr>
         <w:br/>
-        <w:t>• Canine 63-Day Gestation &amp; Due</w:t>
-      </w:r>
-      <w:r>
-        <w:rPr>
-          <w:rFonts w:ascii="Calibri" w:hAnsi="Calibri"/>
-          <w:color w:val="334155"/>
-          <w:sz w:val="19"/>
-        </w:rPr>
-        <w:t xml:space="preserve"> Date Calculator (earliest viable 58d, latest 68d)</w:t>
+        <w:t>• Canine 63-Day Gestation &amp; Due Date Calculator (earliest viable 58d, latest 68d)</w:t>
       </w:r>
       <w:r>
         <w:rPr>
@@ -9423,15 +8522,7 @@
           <w:sz w:val="19"/>
         </w:rPr>
         <w:br/>
-        <w:t>• Daily</w:t>
-      </w:r>
-      <w:r>
-        <w:rPr>
-          <w:rFonts w:ascii="Calibri" w:hAnsi="Calibri"/>
-          <w:color w:val="334155"/>
-          <w:sz w:val="19"/>
-        </w:rPr>
-        <w:t xml:space="preserve"> Puppy Weight Tracker with Growth Chart</w:t>
+        <w:t>• Daily Puppy Weight Tracker with Growth Chart</w:t>
       </w:r>
       <w:r>
         <w:rPr>
@@ -9472,15 +8563,7 @@
           <w:color w:val="334155"/>
           <w:sz w:val="19"/>
         </w:rPr>
-        <w:t xml:space="preserve">: If Tracey completes the Queening </w:t>
-      </w:r>
-      <w:r>
-        <w:rPr>
-          <w:rFonts w:ascii="Calibri" w:hAnsi="Calibri"/>
-          <w:color w:val="334155"/>
-          <w:sz w:val="19"/>
-        </w:rPr>
-        <w:t>section this week, we can review both Cat (65-day gestation) and Dog (63-day gestation) specifications in parallel.</w:t>
+        <w:t>: If Tracey completes the Queening section this week, we can review both Cat (65-day gestation) and Dog (63-day gestation) specifications in parallel.</w:t>
       </w:r>
     </w:p>
     <w:p>
@@ -9503,15 +8586,7 @@
           <w:color w:val="334155"/>
           <w:sz w:val="19"/>
         </w:rPr>
-        <w:t>: The Dog section should be formally activated as Milestone 4 (or a dedicated Canine Addendum). Developm</w:t>
-      </w:r>
-      <w:r>
-        <w:rPr>
-          <w:rFonts w:ascii="Calibri" w:hAnsi="Calibri"/>
-          <w:color w:val="334155"/>
-          <w:sz w:val="19"/>
-        </w:rPr>
-        <w:t>ent can begin immediately upon scope confirmation.</w:t>
+        <w:t>: The Dog section should be formally activated as Milestone 4 (or a dedicated Canine Addendum). Development can begin immediately upon scope confirmation.</w:t>
       </w:r>
     </w:p>
     <w:tbl>
@@ -9578,15 +8653,7 @@
                 <w:sz w:val="18"/>
               </w:rPr>
               <w:br/>
-              <w:t>1. Agreement: Formalize the Dog (and optional Cat/Queening) section as Milestone 4 under the project agreement</w:t>
-            </w:r>
-            <w:r>
-              <w:rPr>
-                <w:rFonts w:ascii="Calibri" w:hAnsi="Calibri"/>
-                <w:color w:val="334155"/>
-                <w:sz w:val="18"/>
-              </w:rPr>
-              <w:t>.</w:t>
+              <w:t>1. Agreement: Formalize the Dog (and optional Cat/Queening) section as Milestone 4 under the project agreement.</w:t>
             </w:r>
             <w:r>
               <w:rPr>
@@ -9740,641 +8807,9 @@
     </w:p>
     <w:p>
       <w:pPr>
-        <w:keepNext/>
-        <w:spacing w:before="280" w:after="80"/>
-      </w:pPr>
-      <w:r>
-        <w:rPr>
-          <w:rFonts w:ascii="Calibri" w:hAnsi="Calibri"/>
-          <w:b/>
-          <w:color w:val="1E3A8A"/>
-          <w:sz w:val="23"/>
-        </w:rPr>
-        <w:t>Item 18: Standalone Marketing Website — Scope, Assets, Functionality &amp; Timeline</w:t>
-      </w:r>
-    </w:p>
-    <w:tbl>
-      <w:tblPr>
-        <w:tblW w:w="0" w:type="auto"/>
-        <w:jc w:val="center"/>
-        <w:tblBorders>
-          <w:top w:val="single" w:sz="8" w:space="0" w:color="D4AF37"/>
-          <w:left w:val="single" w:sz="8" w:space="0" w:color="D4AF37"/>
-          <w:bottom w:val="single" w:sz="8" w:space="0" w:color="D4AF37"/>
-          <w:right w:val="single" w:sz="8" w:space="0" w:color="D4AF37"/>
-        </w:tblBorders>
-        <w:tblLook w:val="04A0" w:firstRow="1" w:lastRow="0" w:firstColumn="1" w:lastColumn="0" w:noHBand="0" w:noVBand="1"/>
-      </w:tblPr>
-      <w:tblGrid>
-        <w:gridCol w:w="5040"/>
-        <w:gridCol w:w="5040"/>
-      </w:tblGrid>
-      <w:tr>
-        <w:trPr>
-          <w:jc w:val="center"/>
-        </w:trPr>
-        <w:tc>
-          <w:tcPr>
-            <w:tcW w:w="5040" w:type="dxa"/>
-            <w:shd w:val="clear" w:color="auto" w:fill="F1F5F9"/>
-            <w:tcMar>
-              <w:top w:w="60" w:type="dxa"/>
-              <w:left w:w="100" w:type="dxa"/>
-              <w:bottom w:w="60" w:type="dxa"/>
-              <w:right w:w="100" w:type="dxa"/>
-            </w:tcMar>
-          </w:tcPr>
-          <w:p>
-            <w:pPr>
-              <w:spacing w:after="0"/>
-            </w:pPr>
-            <w:r>
-              <w:rPr>
-                <w:b/>
-                <w:color w:val="0A192F"/>
-                <w:sz w:val="17"/>
-              </w:rPr>
-              <w:t xml:space="preserve">CLASSIFICATION: [NEW WORKSTREAM SPECIFICATION </w:t>
-            </w:r>
-            <w:r>
-              <w:rPr>
-                <w:b/>
-                <w:color w:val="0A192F"/>
-                <w:sz w:val="17"/>
-              </w:rPr>
-              <w:t>— MARKETING PLATFORM &amp; SITEMAP]</w:t>
-            </w:r>
-            <w:r>
-              <w:rPr>
-                <w:b/>
-                <w:color w:val="0A192F"/>
-                <w:sz w:val="17"/>
-              </w:rPr>
-              <w:br/>
-            </w:r>
-            <w:r>
-              <w:rPr>
-                <w:b/>
-                <w:color w:val="D97706"/>
-                <w:sz w:val="17"/>
-              </w:rPr>
-              <w:t>STATUS: WORKSTREAM ARCHITECTURE, ASSET CHECKLIST &amp; TIMELINE READY ✅</w:t>
-            </w:r>
-          </w:p>
-        </w:tc>
-        <w:tc>
-          <w:tcPr>
-            <w:tcW w:w="5040" w:type="dxa"/>
-            <w:shd w:val="clear" w:color="auto" w:fill="F1F5F9"/>
-            <w:tcMar>
-              <w:top w:w="60" w:type="dxa"/>
-              <w:left w:w="100" w:type="dxa"/>
-              <w:bottom w:w="60" w:type="dxa"/>
-              <w:right w:w="100" w:type="dxa"/>
-            </w:tcMar>
-          </w:tcPr>
-          <w:p>
-            <w:pPr>
-              <w:spacing w:after="0"/>
-            </w:pPr>
-            <w:r>
-              <w:rPr>
-                <w:b/>
-                <w:color w:val="0A192F"/>
-                <w:sz w:val="17"/>
-              </w:rPr>
-              <w:t xml:space="preserve">CORE MODULE: </w:t>
-            </w:r>
-            <w:r>
-              <w:rPr>
-                <w:color w:val="334155"/>
-                <w:sz w:val="17"/>
-              </w:rPr>
-              <w:t>Public-Facing Web Presence for Animal Birthday Predictor (ABP)</w:t>
-            </w:r>
-          </w:p>
-        </w:tc>
-      </w:tr>
-    </w:tbl>
-    <w:p>
-      <w:pPr>
-        <w:spacing w:before="80" w:after="60"/>
-      </w:pPr>
-    </w:p>
-    <w:p>
-      <w:pPr>
-        <w:pStyle w:val="ListBullet"/>
-        <w:spacing w:before="20" w:after="60"/>
-      </w:pPr>
-      <w:r>
-        <w:rPr>
-          <w:rFonts w:ascii="Calibri" w:hAnsi="Calibri"/>
-          <w:b/>
-          <w:color w:val="0A192F"/>
-          <w:sz w:val="19"/>
-        </w:rPr>
-        <w:t>Workstream Separation</w:t>
-      </w:r>
-      <w:r>
-        <w:rPr>
-          <w:rFonts w:ascii="Calibri" w:hAnsi="Calibri"/>
-          <w:color w:val="334155"/>
-          <w:sz w:val="19"/>
-        </w:rPr>
-        <w:t>: The Website should be treated as a dedicated workstream</w:t>
-      </w:r>
-      <w:r>
-        <w:rPr>
-          <w:rFonts w:ascii="Calibri" w:hAnsi="Calibri"/>
-          <w:color w:val="334155"/>
-          <w:sz w:val="19"/>
-        </w:rPr>
-        <w:t xml:space="preserve"> alongside the mobile application, serving as the primary marketing, onboarding, and web-calculator hub.</w:t>
-      </w:r>
-    </w:p>
-    <w:p>
-      <w:pPr>
-        <w:pStyle w:val="ListBullet"/>
-        <w:spacing w:before="20" w:after="60"/>
-      </w:pPr>
-      <w:r>
-        <w:rPr>
-          <w:rFonts w:ascii="Calibri" w:hAnsi="Calibri"/>
-          <w:b/>
-          <w:color w:val="0A192F"/>
-          <w:sz w:val="19"/>
-        </w:rPr>
-        <w:lastRenderedPageBreak/>
-        <w:t>Information &amp; Assets Needed from Tracey</w:t>
-      </w:r>
-      <w:r>
-        <w:rPr>
-          <w:rFonts w:ascii="Calibri" w:hAnsi="Calibri"/>
-          <w:color w:val="334155"/>
-          <w:sz w:val="19"/>
-        </w:rPr>
-        <w:t>: To begin website development, we require from Tracey:</w:t>
-      </w:r>
-      <w:r>
-        <w:rPr>
-          <w:rFonts w:ascii="Calibri" w:hAnsi="Calibri"/>
-          <w:color w:val="334155"/>
-          <w:sz w:val="19"/>
-        </w:rPr>
-        <w:br/>
-        <w:t>1. Official Brand Assets: High-resolution ABP vector log</w:t>
-      </w:r>
-      <w:r>
-        <w:rPr>
-          <w:rFonts w:ascii="Calibri" w:hAnsi="Calibri"/>
-          <w:color w:val="334155"/>
-          <w:sz w:val="19"/>
-        </w:rPr>
-        <w:t>o / crest (PNG/SVG with transparent background).</w:t>
-      </w:r>
-      <w:r>
-        <w:rPr>
-          <w:rFonts w:ascii="Calibri" w:hAnsi="Calibri"/>
-          <w:color w:val="334155"/>
-          <w:sz w:val="19"/>
-        </w:rPr>
-        <w:br/>
-        <w:t>2. Brand Typography &amp; Palette: Confirmation of our Gold (#D4AF37) and Navy (#0A192F) luxury theme.</w:t>
-      </w:r>
-      <w:r>
-        <w:rPr>
-          <w:rFonts w:ascii="Calibri" w:hAnsi="Calibri"/>
-          <w:color w:val="334155"/>
-          <w:sz w:val="19"/>
-        </w:rPr>
-        <w:br/>
-        <w:t>3. Marketing Copy &amp; Taglines: Hero headlines, value proposition, and breeder testimonials.</w:t>
-      </w:r>
-      <w:r>
-        <w:rPr>
-          <w:rFonts w:ascii="Calibri" w:hAnsi="Calibri"/>
-          <w:color w:val="334155"/>
-          <w:sz w:val="19"/>
-        </w:rPr>
-        <w:br/>
-        <w:t>4. High-Res Image</w:t>
-      </w:r>
-      <w:r>
-        <w:rPr>
-          <w:rFonts w:ascii="Calibri" w:hAnsi="Calibri"/>
-          <w:color w:val="334155"/>
-          <w:sz w:val="19"/>
-        </w:rPr>
-        <w:t>ry: Professional photographs of broodmares, stallions, foals, and puppies.</w:t>
-      </w:r>
-      <w:r>
-        <w:rPr>
-          <w:rFonts w:ascii="Calibri" w:hAnsi="Calibri"/>
-          <w:color w:val="334155"/>
-          <w:sz w:val="19"/>
-        </w:rPr>
-        <w:br/>
-        <w:t>5. App Store Links: Apple App Store and Google Play Store developer account details for download badges.</w:t>
-      </w:r>
-      <w:r>
-        <w:rPr>
-          <w:rFonts w:ascii="Calibri" w:hAnsi="Calibri"/>
-          <w:color w:val="334155"/>
-          <w:sz w:val="19"/>
-        </w:rPr>
-        <w:br/>
-        <w:t>6. Pricing &amp; Tier Structure: Package details (e.g. Free Tier vs Pro Stud 20–</w:t>
-      </w:r>
-      <w:r>
-        <w:rPr>
-          <w:rFonts w:ascii="Calibri" w:hAnsi="Calibri"/>
-          <w:color w:val="334155"/>
-          <w:sz w:val="19"/>
-        </w:rPr>
-        <w:t>100 Mares Tier).</w:t>
-      </w:r>
-      <w:r>
-        <w:rPr>
-          <w:rFonts w:ascii="Calibri" w:hAnsi="Calibri"/>
-          <w:color w:val="334155"/>
-          <w:sz w:val="19"/>
-        </w:rPr>
-        <w:br/>
-        <w:t>7. Legal &amp; Contact: Domain name DNS access, contact/support email, and solicitor-approved legal terms.</w:t>
-      </w:r>
-    </w:p>
-    <w:p>
-      <w:pPr>
-        <w:pStyle w:val="ListBullet"/>
-        <w:spacing w:before="20" w:after="60"/>
-      </w:pPr>
-      <w:r>
-        <w:rPr>
-          <w:rFonts w:ascii="Calibri" w:hAnsi="Calibri"/>
-          <w:b/>
-          <w:color w:val="0A192F"/>
-          <w:sz w:val="19"/>
-        </w:rPr>
-        <w:t>Recommended 6-Page Website Sitemap</w:t>
-      </w:r>
-      <w:r>
-        <w:rPr>
-          <w:rFonts w:ascii="Calibri" w:hAnsi="Calibri"/>
-          <w:color w:val="334155"/>
-          <w:sz w:val="19"/>
-        </w:rPr>
-        <w:t>: • Page 1: Home / Hero Showcase (Luxury app preview, video demo, download CTA)</w:t>
-      </w:r>
-      <w:r>
-        <w:rPr>
-          <w:rFonts w:ascii="Calibri" w:hAnsi="Calibri"/>
-          <w:color w:val="334155"/>
-          <w:sz w:val="19"/>
-        </w:rPr>
-        <w:br/>
-        <w:t>• Page 2: Equine Modul</w:t>
-      </w:r>
-      <w:r>
-        <w:rPr>
-          <w:rFonts w:ascii="Calibri" w:hAnsi="Calibri"/>
-          <w:color w:val="334155"/>
-          <w:sz w:val="19"/>
-        </w:rPr>
-        <w:t>e Showcase (Stud foaling diary, breeding wizard, ultrasound schedule)</w:t>
-      </w:r>
-      <w:r>
-        <w:rPr>
-          <w:rFonts w:ascii="Calibri" w:hAnsi="Calibri"/>
-          <w:color w:val="334155"/>
-          <w:sz w:val="19"/>
-        </w:rPr>
-        <w:br/>
-        <w:t>• Page 3: Canine &amp; Multi-Species Hub (Whelping manager, puppy birth logs)</w:t>
-      </w:r>
-      <w:r>
-        <w:rPr>
-          <w:rFonts w:ascii="Calibri" w:hAnsi="Calibri"/>
-          <w:color w:val="334155"/>
-          <w:sz w:val="19"/>
-        </w:rPr>
-        <w:br/>
-        <w:t>• Page 4: Interactive Web Due-Date Calculator (Free lead-generation calculator tool)</w:t>
-      </w:r>
-      <w:r>
-        <w:rPr>
-          <w:rFonts w:ascii="Calibri" w:hAnsi="Calibri"/>
-          <w:color w:val="334155"/>
-          <w:sz w:val="19"/>
-        </w:rPr>
-        <w:br/>
-        <w:t>• Page 5: Pricing &amp; Breeder</w:t>
-      </w:r>
-      <w:r>
-        <w:rPr>
-          <w:rFonts w:ascii="Calibri" w:hAnsi="Calibri"/>
-          <w:color w:val="334155"/>
-          <w:sz w:val="19"/>
-        </w:rPr>
-        <w:t xml:space="preserve"> Plans (Tier breakdown with transparent feature comparisons)</w:t>
-      </w:r>
-      <w:r>
-        <w:rPr>
-          <w:rFonts w:ascii="Calibri" w:hAnsi="Calibri"/>
-          <w:color w:val="334155"/>
-          <w:sz w:val="19"/>
-        </w:rPr>
-        <w:br/>
-        <w:t>• Page 6: FAQ, Knowledge Center &amp; Contact Form (Searchable breeder questions + direct support).</w:t>
-      </w:r>
-    </w:p>
-    <w:p>
-      <w:pPr>
-        <w:pStyle w:val="ListBullet"/>
-        <w:spacing w:before="20" w:after="60"/>
-      </w:pPr>
-      <w:r>
-        <w:rPr>
-          <w:rFonts w:ascii="Calibri" w:hAnsi="Calibri"/>
-          <w:b/>
-          <w:color w:val="0A192F"/>
-          <w:sz w:val="19"/>
-        </w:rPr>
-        <w:t>Technology Stack &amp; Architecture</w:t>
-      </w:r>
-      <w:r>
-        <w:rPr>
-          <w:rFonts w:ascii="Calibri" w:hAnsi="Calibri"/>
-          <w:color w:val="334155"/>
-          <w:sz w:val="19"/>
-        </w:rPr>
-        <w:t xml:space="preserve">: Built using modern Next.js / React with Vanilla CSS tokens, </w:t>
-      </w:r>
-      <w:r>
-        <w:rPr>
-          <w:rFonts w:ascii="Calibri" w:hAnsi="Calibri"/>
-          <w:color w:val="334155"/>
-          <w:sz w:val="19"/>
-        </w:rPr>
-        <w:t>responsive layout, SEO-optimized meta tags, SSL encryption, and direct app store deep-linking.</w:t>
-      </w:r>
-    </w:p>
-    <w:p>
-      <w:pPr>
-        <w:pStyle w:val="ListBullet"/>
-        <w:spacing w:before="20" w:after="60"/>
-      </w:pPr>
-      <w:r>
-        <w:rPr>
-          <w:rFonts w:ascii="Calibri" w:hAnsi="Calibri"/>
-          <w:b/>
-          <w:color w:val="0A192F"/>
-          <w:sz w:val="19"/>
-        </w:rPr>
-        <w:t>Implementation Roadmap (3 Weeks)</w:t>
-      </w:r>
-      <w:r>
-        <w:rPr>
-          <w:rFonts w:ascii="Calibri" w:hAnsi="Calibri"/>
-          <w:color w:val="334155"/>
-          <w:sz w:val="19"/>
-        </w:rPr>
-        <w:t>: • Week 1: Wireframes, Design System &amp; Copywriting Alignment</w:t>
-      </w:r>
-      <w:r>
-        <w:rPr>
-          <w:rFonts w:ascii="Calibri" w:hAnsi="Calibri"/>
-          <w:color w:val="334155"/>
-          <w:sz w:val="19"/>
-        </w:rPr>
-        <w:br/>
-        <w:t>• Week 2: Responsive Frontend Development &amp; Interactive Web Due-Dat</w:t>
-      </w:r>
-      <w:r>
-        <w:rPr>
-          <w:rFonts w:ascii="Calibri" w:hAnsi="Calibri"/>
-          <w:color w:val="334155"/>
-          <w:sz w:val="19"/>
-        </w:rPr>
-        <w:t>e Calculator</w:t>
-      </w:r>
-      <w:r>
-        <w:rPr>
-          <w:rFonts w:ascii="Calibri" w:hAnsi="Calibri"/>
-          <w:color w:val="334155"/>
-          <w:sz w:val="19"/>
-        </w:rPr>
-        <w:br/>
-        <w:t>• Week 3: SEO Optimization, DNS Domain Launch &amp; App Store Integration.</w:t>
-      </w:r>
-    </w:p>
-    <w:tbl>
-      <w:tblPr>
-        <w:tblW w:w="0" w:type="auto"/>
-        <w:jc w:val="center"/>
-        <w:tblBorders>
-          <w:left w:val="single" w:sz="16" w:space="0" w:color="059669"/>
-        </w:tblBorders>
-        <w:tblLook w:val="04A0" w:firstRow="1" w:lastRow="0" w:firstColumn="1" w:lastColumn="0" w:noHBand="0" w:noVBand="1"/>
-      </w:tblPr>
-      <w:tblGrid>
-        <w:gridCol w:w="10080"/>
-      </w:tblGrid>
-      <w:tr>
-        <w:trPr>
-          <w:jc w:val="center"/>
-        </w:trPr>
-        <w:tc>
-          <w:tcPr>
-            <w:tcW w:w="10080" w:type="dxa"/>
-            <w:shd w:val="clear" w:color="auto" w:fill="ECFDF5"/>
-            <w:tcMar>
-              <w:top w:w="100" w:type="dxa"/>
-              <w:left w:w="140" w:type="dxa"/>
-              <w:bottom w:w="100" w:type="dxa"/>
-              <w:right w:w="140" w:type="dxa"/>
-            </w:tcMar>
-          </w:tcPr>
-          <w:p>
-            <w:pPr>
-              <w:spacing w:after="0"/>
-            </w:pPr>
-            <w:r>
-              <w:rPr>
-                <w:rFonts w:ascii="Calibri" w:hAnsi="Calibri"/>
-                <w:b/>
-                <w:color w:val="059669"/>
-                <w:sz w:val="19"/>
-              </w:rPr>
-              <w:t>DIRECT ANSWER &amp; TECHNICAL RECOMMENDATION (ITEM 18)</w:t>
-            </w:r>
-            <w:r>
-              <w:rPr>
-                <w:rFonts w:ascii="Calibri" w:hAnsi="Calibri"/>
-                <w:b/>
-                <w:color w:val="059669"/>
-                <w:sz w:val="19"/>
-              </w:rPr>
-              <w:br/>
-            </w:r>
-            <w:r>
-              <w:rPr>
-                <w:rFonts w:ascii="Calibri" w:hAnsi="Calibri"/>
-                <w:color w:val="334155"/>
-                <w:sz w:val="18"/>
-              </w:rPr>
-              <w:t>WEBSITE ACTION PLAN:</w:t>
-            </w:r>
-            <w:r>
-              <w:rPr>
-                <w:rFonts w:ascii="Calibri" w:hAnsi="Calibri"/>
-                <w:color w:val="334155"/>
-                <w:sz w:val="18"/>
-              </w:rPr>
-              <w:br/>
-              <w:t>We are ready to start the website workstream immediately. As soon as Tracey approves the 6-page site</w:t>
-            </w:r>
-            <w:r>
-              <w:rPr>
-                <w:rFonts w:ascii="Calibri" w:hAnsi="Calibri"/>
-                <w:color w:val="334155"/>
-                <w:sz w:val="18"/>
-              </w:rPr>
-              <w:t>map and provides the high-res logo and copy assets outlined in our checklist, we will deliver the live website within a structured 3-week timeline.</w:t>
-            </w:r>
-          </w:p>
-        </w:tc>
-      </w:tr>
-    </w:tbl>
-    <w:p>
-      <w:pPr>
         <w:spacing w:before="20" w:after="60"/>
       </w:pPr>
     </w:p>
-    <w:tbl>
-      <w:tblPr>
-        <w:tblW w:w="0" w:type="auto"/>
-        <w:jc w:val="center"/>
-        <w:tblBorders>
-          <w:top w:val="single" w:sz="6" w:space="0" w:color="D4AF37"/>
-          <w:left w:val="single" w:sz="6" w:space="0" w:color="D4AF37"/>
-          <w:bottom w:val="single" w:sz="6" w:space="0" w:color="D4AF37"/>
-          <w:right w:val="single" w:sz="6" w:space="0" w:color="D4AF37"/>
-        </w:tblBorders>
-        <w:tblLook w:val="04A0" w:firstRow="1" w:lastRow="0" w:firstColumn="1" w:lastColumn="0" w:noHBand="0" w:noVBand="1"/>
-      </w:tblPr>
-      <w:tblGrid>
-        <w:gridCol w:w="10080"/>
-      </w:tblGrid>
-      <w:tr>
-        <w:trPr>
-          <w:jc w:val="center"/>
-        </w:trPr>
-        <w:tc>
-          <w:tcPr>
-            <w:tcW w:w="10080" w:type="dxa"/>
-            <w:shd w:val="clear" w:color="auto" w:fill="F8FAFC"/>
-            <w:tcMar>
-              <w:top w:w="80" w:type="dxa"/>
-              <w:left w:w="100" w:type="dxa"/>
-              <w:bottom w:w="80" w:type="dxa"/>
-              <w:right w:w="100" w:type="dxa"/>
-            </w:tcMar>
-          </w:tcPr>
-          <w:p>
-            <w:pPr>
-              <w:spacing w:after="40"/>
-              <w:jc w:val="center"/>
-            </w:pPr>
-            <w:r>
-              <w:rPr>
-                <w:b/>
-                <w:color w:val="059669"/>
-                <w:sz w:val="17"/>
-              </w:rPr>
-              <w:t xml:space="preserve">[KNOWLEDGE BASE]  </w:t>
-            </w:r>
-            <w:r>
-              <w:rPr>
-                <w:b/>
-                <w:color w:val="0A192F"/>
-                <w:sz w:val="18"/>
-              </w:rPr>
-              <w:t>Interactive FAQ &amp; Help Center</w:t>
-            </w:r>
-            <w:r>
-              <w:rPr>
-                <w:b/>
-                <w:color w:val="0A192F"/>
-                <w:sz w:val="18"/>
-              </w:rPr>
-              <w:br/>
-            </w:r>
-            <w:r>
-              <w:rPr>
-                <w:color w:val="64748B"/>
-                <w:sz w:val="16"/>
-              </w:rPr>
-              <w:t xml:space="preserve">Searchable knowledge base with category filters and </w:t>
-            </w:r>
-            <w:r>
-              <w:rPr>
-                <w:color w:val="64748B"/>
-                <w:sz w:val="16"/>
-              </w:rPr>
-              <w:t>accordion answers</w:t>
-            </w:r>
-            <w:r>
-              <w:rPr>
-                <w:color w:val="64748B"/>
-                <w:sz w:val="16"/>
-              </w:rPr>
-              <w:br/>
-            </w:r>
-            <w:r>
-              <w:rPr>
-                <w:noProof/>
-              </w:rPr>
-              <w:lastRenderedPageBreak/>
-              <w:drawing>
-                <wp:inline distT="0" distB="0" distL="0" distR="0">
-                  <wp:extent cx="2926080" cy="6380480"/>
-                  <wp:effectExtent l="0" t="0" r="0" b="0"/>
-                  <wp:docPr id="16" name="Picture 16"/>
-                  <wp:cNvGraphicFramePr>
-                    <a:graphicFrameLocks xmlns:a="http://schemas.openxmlformats.org/drawingml/2006/main" noChangeAspect="1"/>
-                  </wp:cNvGraphicFramePr>
-                  <a:graphic xmlns:a="http://schemas.openxmlformats.org/drawingml/2006/main">
-                    <a:graphicData uri="http://schemas.openxmlformats.org/drawingml/2006/picture">
-                      <pic:pic xmlns:pic="http://schemas.openxmlformats.org/drawingml/2006/picture">
-                        <pic:nvPicPr>
-                          <pic:cNvPr id="0" name="image.png"/>
-                          <pic:cNvPicPr/>
-                        </pic:nvPicPr>
-                        <pic:blipFill>
-                          <a:blip r:embed="rId24"/>
-                          <a:stretch>
-                            <a:fillRect/>
-                          </a:stretch>
-                        </pic:blipFill>
-                        <pic:spPr>
-                          <a:xfrm>
-                            <a:off x="0" y="0"/>
-                            <a:ext cx="2926080" cy="6380480"/>
-                          </a:xfrm>
-                          <a:prstGeom prst="rect">
-                            <a:avLst/>
-                          </a:prstGeom>
-                        </pic:spPr>
-                      </pic:pic>
-                    </a:graphicData>
-                  </a:graphic>
-                </wp:inline>
-              </w:drawing>
-            </w:r>
-          </w:p>
-        </w:tc>
-      </w:tr>
-    </w:tbl>
     <w:p>
       <w:pPr>
         <w:spacing w:before="20" w:after="60"/>
@@ -10392,7 +8827,7 @@
           <w:color w:val="0A192F"/>
           <w:sz w:val="27"/>
         </w:rPr>
-        <w:t>3. Conclusion &amp; Recommended Action Plan</w:t>
+        <w:t xml:space="preserve"> Conclusion &amp; Recommended Action Plan</w:t>
       </w:r>
     </w:p>
     <w:p>
@@ -10405,7 +8840,7 @@
           <w:color w:val="334155"/>
           <w:sz w:val="19"/>
         </w:rPr>
-        <w:t>All 18 items and inquiries presented by Tracey have been comprehensively reviewed, technically solved, and documented. The highest priority equine modifications (Dewormer ➔ Wormer, Dam/Sire term</w:t>
+        <w:t>All 17</w:t>
       </w:r>
       <w:r>
         <w:rPr>
@@ -10413,7 +8848,7 @@
           <w:color w:val="334155"/>
           <w:sz w:val="19"/>
         </w:rPr>
-        <w:t>inology, Step 3 Recipient triggers, Step 5 Dental ordering, and Step 6 Due Date placement) are completely aligned with professional breeding standards.</w:t>
+        <w:t xml:space="preserve"> items and inquiries presented by Tracey have been comprehensively reviewed, technically solved, and documented. The highest priority equine modifications (Dewormer ➔ Wormer, Dam/Sire terminology, Step 3 Recipient triggers, Step 5 Dental ordering, and Step 6 Due Date placement) are completely aligned with professional breeding standards.</w:t>
       </w:r>
     </w:p>
     <w:p>
@@ -10426,122 +8861,19 @@
           <w:color w:val="334155"/>
           <w:sz w:val="19"/>
         </w:rPr>
-        <w:t>The high-value clinical enhancements — including the 30-day Caslick Alert, the 1-2-3 Foaling Medical Pro</w:t>
+        <w:t>The high-value clinical enhancements — including the 30-day Caslick Alert, the 1-2-3 Foaling Medical Protocol, and the Unique Certificate ID scheme — elevate the Animal Birt</w:t>
       </w:r>
+      <w:bookmarkStart w:id="0" w:name="_GoBack"/>
+      <w:bookmarkEnd w:id="0"/>
       <w:r>
         <w:rPr>
           <w:rFonts w:ascii="Calibri" w:hAnsi="Calibri"/>
           <w:color w:val="334155"/>
           <w:sz w:val="19"/>
         </w:rPr>
-        <w:t>tocol, and the Unique Certificate ID scheme — elevate the Animal Birthday Predictor into a world-class, commercial-grade platform.</w:t>
+        <w:t>hday Predictor into a world-class, commercial-grade platform.</w:t>
       </w:r>
     </w:p>
-    <w:tbl>
-      <w:tblPr>
-        <w:tblW w:w="0" w:type="auto"/>
-        <w:jc w:val="center"/>
-        <w:tblBorders>
-          <w:left w:val="single" w:sz="16" w:space="0" w:color="D4AF37"/>
-        </w:tblBorders>
-        <w:tblLook w:val="04A0" w:firstRow="1" w:lastRow="0" w:firstColumn="1" w:lastColumn="0" w:noHBand="0" w:noVBand="1"/>
-      </w:tblPr>
-      <w:tblGrid>
-        <w:gridCol w:w="10080"/>
-      </w:tblGrid>
-      <w:tr>
-        <w:trPr>
-          <w:jc w:val="center"/>
-        </w:trPr>
-        <w:tc>
-          <w:tcPr>
-            <w:tcW w:w="10080" w:type="dxa"/>
-            <w:shd w:val="clear" w:color="auto" w:fill="F8FAFC"/>
-            <w:tcMar>
-              <w:top w:w="100" w:type="dxa"/>
-              <w:left w:w="140" w:type="dxa"/>
-              <w:bottom w:w="100" w:type="dxa"/>
-              <w:right w:w="140" w:type="dxa"/>
-            </w:tcMar>
-          </w:tcPr>
-          <w:p>
-            <w:pPr>
-              <w:spacing w:after="0"/>
-            </w:pPr>
-            <w:r>
-              <w:rPr>
-                <w:rFonts w:ascii="Calibri" w:hAnsi="Calibri"/>
-                <w:b/>
-                <w:color w:val="0A192F"/>
-                <w:sz w:val="19"/>
-              </w:rPr>
-              <w:t>SUMMARY OF IMMEDIATE ACTION ITEMS FOR CLIENT APPROVAL</w:t>
-            </w:r>
-            <w:r>
-              <w:rPr>
-                <w:rFonts w:ascii="Calibri" w:hAnsi="Calibri"/>
-                <w:b/>
-                <w:color w:val="0A192F"/>
-                <w:sz w:val="19"/>
-              </w:rPr>
-              <w:br/>
-            </w:r>
-            <w:r>
-              <w:rPr>
-                <w:rFonts w:ascii="Calibri" w:hAnsi="Calibri"/>
-                <w:color w:val="334155"/>
-                <w:sz w:val="18"/>
-              </w:rPr>
-              <w:lastRenderedPageBreak/>
-              <w:t xml:space="preserve">1. Confirm acceptance of the 18 technical solutions detailed in this </w:t>
-            </w:r>
-            <w:r>
-              <w:rPr>
-                <w:rFonts w:ascii="Calibri" w:hAnsi="Calibri"/>
-                <w:color w:val="334155"/>
-                <w:sz w:val="18"/>
-              </w:rPr>
-              <w:t>document.</w:t>
-            </w:r>
-            <w:r>
-              <w:rPr>
-                <w:rFonts w:ascii="Calibri" w:hAnsi="Calibri"/>
-                <w:color w:val="334155"/>
-                <w:sz w:val="18"/>
-              </w:rPr>
-              <w:br/>
-              <w:t>2. Approve the ABP-EQ-YYYY-XXXXXX Unique Certificate ID numbering format and watermark placement.</w:t>
-            </w:r>
-            <w:r>
-              <w:rPr>
-                <w:rFonts w:ascii="Calibri" w:hAnsi="Calibri"/>
-                <w:color w:val="334155"/>
-                <w:sz w:val="18"/>
-              </w:rPr>
-              <w:br/>
-              <w:t>3. Formalize Milestone 4 for the Dog (and Cat/Queening) section upon receipt of breed specifications.</w:t>
-            </w:r>
-            <w:r>
-              <w:rPr>
-                <w:rFonts w:ascii="Calibri" w:hAnsi="Calibri"/>
-                <w:color w:val="334155"/>
-                <w:sz w:val="18"/>
-              </w:rPr>
-              <w:br/>
-              <w:t>4. Provide the brand assets and copy listed in</w:t>
-            </w:r>
-            <w:r>
-              <w:rPr>
-                <w:rFonts w:ascii="Calibri" w:hAnsi="Calibri"/>
-                <w:color w:val="334155"/>
-                <w:sz w:val="18"/>
-              </w:rPr>
-              <w:t xml:space="preserve"> Item 18 to initiate the 3-Week Website workstream.</w:t>
-            </w:r>
-          </w:p>
-        </w:tc>
-      </w:tr>
-    </w:tbl>
     <w:p>
       <w:pPr>
         <w:spacing w:before="20" w:after="60"/>
@@ -33451,7 +31783,7 @@
 </file>
 
 <file path=customXml/itemProps1.xml><?xml version="1.0" encoding="utf-8"?>
-<ds:datastoreItem xmlns:ds="http://schemas.openxmlformats.org/officeDocument/2006/customXml" ds:itemID="{DB777448-70C8-4DFC-8E5E-39DEED4AB535}">
+<ds:datastoreItem xmlns:ds="http://schemas.openxmlformats.org/officeDocument/2006/customXml" ds:itemID="{1686E70F-248F-4A8A-B3D0-35BFC4E6E387}">
   <ds:schemaRefs>
     <ds:schemaRef ds:uri="http://schemas.openxmlformats.org/officeDocument/2006/bibliography"/>
   </ds:schemaRefs>

</xml_diff>